<commit_message>
feat(auth,admin,blocks): add reset pw, lockout, maintenance
- Add forgot/reset password flow + HTML emails (Better Auth)
- Add login lockout (3 fails -> 5 min)
- Allow role change to SUPER_ADMIN; add position rules on create
- Add global block type (university vs maintenance) + admin access
- Block bookings during maintenance for non-admin roles
- Add Prisma migration for VenueBlockType
</commit_message>
<xml_diff>
--- a/public/templates/student-activity-proposal-form-v2.docx
+++ b/public/templates/student-activity-proposal-form-v2.docx
@@ -211,7 +211,7 @@
           <w:szCs w:val="28"/>
         </w:rPr>
         <w:drawing>
-          <wp:anchor distT="0" distB="0" distL="114300" distR="114300" simplePos="0" relativeHeight="251665408" behindDoc="0" locked="0" layoutInCell="1" allowOverlap="1" wp14:anchorId="4D66C737" wp14:editId="14D2D932">
+          <wp:anchor distT="0" distB="0" distL="114300" distR="114300" simplePos="0" relativeHeight="251665408" behindDoc="0" locked="0" layoutInCell="1" allowOverlap="1" wp14:anchorId="4D66C737" wp14:editId="6C3A2E0A">
             <wp:simplePos x="0" y="0"/>
             <wp:positionH relativeFrom="column">
               <wp:posOffset>190004</wp:posOffset>
@@ -276,7 +276,7 @@
           <w:szCs w:val="28"/>
         </w:rPr>
         <w:drawing>
-          <wp:anchor distT="0" distB="0" distL="114300" distR="114300" simplePos="0" relativeHeight="251659264" behindDoc="0" locked="0" layoutInCell="1" allowOverlap="1" wp14:anchorId="31EB85D4" wp14:editId="34935FE6">
+          <wp:anchor distT="0" distB="0" distL="114300" distR="114300" simplePos="0" relativeHeight="251659264" behindDoc="0" locked="0" layoutInCell="1" allowOverlap="1" wp14:anchorId="31EB85D4" wp14:editId="29FD0F21">
             <wp:simplePos x="0" y="0"/>
             <wp:positionH relativeFrom="column">
               <wp:posOffset>-474914</wp:posOffset>
@@ -592,6 +592,7 @@
               <w:t>{</w:t>
             </w:r>
             <w:proofErr w:type="spellStart"/>
+            <w:proofErr w:type="gramStart"/>
             <w:r>
               <w:rPr>
                 <w:rFonts w:ascii="Arial Narrow" w:hAnsi="Arial Narrow"/>
@@ -603,7 +604,14 @@
               <w:rPr>
                 <w:rFonts w:ascii="Arial Narrow" w:hAnsi="Arial Narrow"/>
               </w:rPr>
-              <w:t xml:space="preserve">}) Alternative </w:t>
+              <w:t>})</w:t>
+            </w:r>
+            <w:proofErr w:type="gramEnd"/>
+            <w:r>
+              <w:rPr>
+                <w:rFonts w:ascii="Arial Narrow" w:hAnsi="Arial Narrow"/>
+              </w:rPr>
+              <w:t xml:space="preserve"> Alternative </w:t>
             </w:r>
             <w:proofErr w:type="gramStart"/>
             <w:r>
@@ -620,6 +628,7 @@
               <w:t>{</w:t>
             </w:r>
             <w:proofErr w:type="spellStart"/>
+            <w:proofErr w:type="gramStart"/>
             <w:r>
               <w:rPr>
                 <w:rFonts w:ascii="Arial Narrow" w:hAnsi="Arial Narrow"/>
@@ -631,7 +640,14 @@
               <w:rPr>
                 <w:rFonts w:ascii="Arial Narrow" w:hAnsi="Arial Narrow"/>
               </w:rPr>
-              <w:t xml:space="preserve">}) Graduate </w:t>
+              <w:t>})</w:t>
+            </w:r>
+            <w:proofErr w:type="gramEnd"/>
+            <w:r>
+              <w:rPr>
+                <w:rFonts w:ascii="Arial Narrow" w:hAnsi="Arial Narrow"/>
+              </w:rPr>
+              <w:t xml:space="preserve"> Graduate </w:t>
             </w:r>
             <w:proofErr w:type="gramStart"/>
             <w:r>
@@ -648,6 +664,7 @@
               <w:t>{</w:t>
             </w:r>
             <w:proofErr w:type="spellStart"/>
+            <w:proofErr w:type="gramStart"/>
             <w:r>
               <w:rPr>
                 <w:rFonts w:ascii="Arial Narrow" w:hAnsi="Arial Narrow"/>
@@ -659,7 +676,14 @@
               <w:rPr>
                 <w:rFonts w:ascii="Arial Narrow" w:hAnsi="Arial Narrow"/>
               </w:rPr>
-              <w:t xml:space="preserve">}) Extensions </w:t>
+              <w:t>})</w:t>
+            </w:r>
+            <w:proofErr w:type="gramEnd"/>
+            <w:r>
+              <w:rPr>
+                <w:rFonts w:ascii="Arial Narrow" w:hAnsi="Arial Narrow"/>
+              </w:rPr>
+              <w:t xml:space="preserve"> Extensions </w:t>
             </w:r>
             <w:proofErr w:type="gramStart"/>
             <w:r>
@@ -676,6 +700,7 @@
               <w:t>{</w:t>
             </w:r>
             <w:proofErr w:type="spellStart"/>
+            <w:proofErr w:type="gramStart"/>
             <w:r>
               <w:rPr>
                 <w:rFonts w:ascii="Arial Narrow" w:hAnsi="Arial Narrow"/>
@@ -687,7 +712,14 @@
               <w:rPr>
                 <w:rFonts w:ascii="Arial Narrow" w:hAnsi="Arial Narrow"/>
               </w:rPr>
-              <w:t>}) COM</w:t>
+              <w:t>})</w:t>
+            </w:r>
+            <w:proofErr w:type="gramEnd"/>
+            <w:r>
+              <w:rPr>
+                <w:rFonts w:ascii="Arial Narrow" w:hAnsi="Arial Narrow"/>
+              </w:rPr>
+              <w:t xml:space="preserve"> COM</w:t>
             </w:r>
           </w:p>
         </w:tc>
@@ -1497,6 +1529,7 @@
               <w:t>{</w:t>
             </w:r>
             <w:proofErr w:type="spellStart"/>
+            <w:proofErr w:type="gramStart"/>
             <w:r>
               <w:rPr>
                 <w:rFonts w:ascii="Arial Narrow" w:hAnsi="Arial Narrow"/>
@@ -1508,7 +1541,14 @@
               <w:rPr>
                 <w:rFonts w:ascii="Arial Narrow" w:hAnsi="Arial Narrow"/>
               </w:rPr>
-              <w:t>}) Hybrid</w:t>
+              <w:t>})</w:t>
+            </w:r>
+            <w:proofErr w:type="gramEnd"/>
+            <w:r>
+              <w:rPr>
+                <w:rFonts w:ascii="Arial Narrow" w:hAnsi="Arial Narrow"/>
+              </w:rPr>
+              <w:t xml:space="preserve"> Hybrid</w:t>
             </w:r>
           </w:p>
         </w:tc>
@@ -1922,6 +1962,7 @@
               <w:t>{</w:t>
             </w:r>
             <w:proofErr w:type="spellStart"/>
+            <w:proofErr w:type="gramStart"/>
             <w:r>
               <w:rPr>
                 <w:rFonts w:ascii="Arial Narrow" w:hAnsi="Arial Narrow"/>
@@ -1933,7 +1974,14 @@
               <w:rPr>
                 <w:rFonts w:ascii="Arial Narrow" w:hAnsi="Arial Narrow"/>
               </w:rPr>
-              <w:t>}) Extra-Curricular</w:t>
+              <w:t>})</w:t>
+            </w:r>
+            <w:proofErr w:type="gramEnd"/>
+            <w:r>
+              <w:rPr>
+                <w:rFonts w:ascii="Arial Narrow" w:hAnsi="Arial Narrow"/>
+              </w:rPr>
+              <w:t xml:space="preserve"> Extra-Curricular</w:t>
             </w:r>
           </w:p>
         </w:tc>
@@ -2056,6 +2104,7 @@
               <w:t>{</w:t>
             </w:r>
             <w:proofErr w:type="spellStart"/>
+            <w:proofErr w:type="gramStart"/>
             <w:r>
               <w:rPr>
                 <w:rFonts w:ascii="Arial Narrow" w:hAnsi="Arial Narrow"/>
@@ -2069,6 +2118,7 @@
               </w:rPr>
               <w:t>})</w:t>
             </w:r>
+            <w:proofErr w:type="gramEnd"/>
           </w:p>
           <w:p>
             <w:pPr>
@@ -2099,6 +2149,7 @@
               <w:t>{</w:t>
             </w:r>
             <w:proofErr w:type="spellStart"/>
+            <w:proofErr w:type="gramStart"/>
             <w:r>
               <w:rPr>
                 <w:rFonts w:ascii="Arial Narrow" w:hAnsi="Arial Narrow"/>
@@ -2110,7 +2161,14 @@
               <w:rPr>
                 <w:rFonts w:ascii="Arial Narrow" w:hAnsi="Arial Narrow"/>
               </w:rPr>
-              <w:t xml:space="preserve">}) Regional  </w:t>
+              <w:t>})</w:t>
+            </w:r>
+            <w:proofErr w:type="gramEnd"/>
+            <w:r>
+              <w:rPr>
+                <w:rFonts w:ascii="Arial Narrow" w:hAnsi="Arial Narrow"/>
+              </w:rPr>
+              <w:t xml:space="preserve"> Regional  </w:t>
             </w:r>
             <w:proofErr w:type="gramStart"/>
             <w:r>
@@ -2127,6 +2185,7 @@
               <w:t>{</w:t>
             </w:r>
             <w:proofErr w:type="spellStart"/>
+            <w:proofErr w:type="gramStart"/>
             <w:r>
               <w:rPr>
                 <w:rFonts w:ascii="Arial Narrow" w:hAnsi="Arial Narrow"/>
@@ -2138,7 +2197,14 @@
               <w:rPr>
                 <w:rFonts w:ascii="Arial Narrow" w:hAnsi="Arial Narrow"/>
               </w:rPr>
-              <w:t>}) National</w:t>
+              <w:t>})</w:t>
+            </w:r>
+            <w:proofErr w:type="gramEnd"/>
+            <w:r>
+              <w:rPr>
+                <w:rFonts w:ascii="Arial Narrow" w:hAnsi="Arial Narrow"/>
+              </w:rPr>
+              <w:t xml:space="preserve"> National</w:t>
             </w:r>
           </w:p>
         </w:tc>
@@ -2273,6 +2339,7 @@
               <w:t>{</w:t>
             </w:r>
             <w:proofErr w:type="spellStart"/>
+            <w:proofErr w:type="gramStart"/>
             <w:r>
               <w:rPr>
                 <w:rFonts w:ascii="Arial Narrow" w:hAnsi="Arial Narrow"/>
@@ -2284,7 +2351,14 @@
               <w:rPr>
                 <w:rFonts w:ascii="Arial Narrow" w:hAnsi="Arial Narrow"/>
               </w:rPr>
-              <w:t xml:space="preserve">}) Leadership Summit  </w:t>
+              <w:t>})</w:t>
+            </w:r>
+            <w:proofErr w:type="gramEnd"/>
+            <w:r>
+              <w:rPr>
+                <w:rFonts w:ascii="Arial Narrow" w:hAnsi="Arial Narrow"/>
+              </w:rPr>
+              <w:t xml:space="preserve"> Leadership Summit  </w:t>
             </w:r>
             <w:proofErr w:type="gramStart"/>
             <w:r>
@@ -2301,6 +2375,7 @@
               <w:t>{</w:t>
             </w:r>
             <w:proofErr w:type="spellStart"/>
+            <w:proofErr w:type="gramStart"/>
             <w:r>
               <w:rPr>
                 <w:rFonts w:ascii="Arial Narrow" w:hAnsi="Arial Narrow"/>
@@ -2312,7 +2387,14 @@
               <w:rPr>
                 <w:rFonts w:ascii="Arial Narrow" w:hAnsi="Arial Narrow"/>
               </w:rPr>
-              <w:t xml:space="preserve">}) General Assembly  </w:t>
+              <w:t>})</w:t>
+            </w:r>
+            <w:proofErr w:type="gramEnd"/>
+            <w:r>
+              <w:rPr>
+                <w:rFonts w:ascii="Arial Narrow" w:hAnsi="Arial Narrow"/>
+              </w:rPr>
+              <w:t xml:space="preserve"> General Assembly  </w:t>
             </w:r>
             <w:proofErr w:type="gramStart"/>
             <w:r>
@@ -2329,6 +2411,7 @@
               <w:t>{</w:t>
             </w:r>
             <w:proofErr w:type="spellStart"/>
+            <w:proofErr w:type="gramStart"/>
             <w:r>
               <w:rPr>
                 <w:rFonts w:ascii="Arial Narrow" w:hAnsi="Arial Narrow"/>
@@ -2340,7 +2423,14 @@
               <w:rPr>
                 <w:rFonts w:ascii="Arial Narrow" w:hAnsi="Arial Narrow"/>
               </w:rPr>
-              <w:t xml:space="preserve">}) </w:t>
+              <w:t>})</w:t>
+            </w:r>
+            <w:proofErr w:type="gramEnd"/>
+            <w:r>
+              <w:rPr>
+                <w:rFonts w:ascii="Arial Narrow" w:hAnsi="Arial Narrow"/>
+              </w:rPr>
+              <w:t xml:space="preserve"> </w:t>
             </w:r>
           </w:p>
           <w:p>
@@ -3707,6 +3797,29 @@
               </w:rPr>
               <w:t>SOUND SYSTEM</w:t>
             </w:r>
+            <w:r>
+              <w:rPr>
+                <w:rFonts w:ascii="Arial Narrow" w:hAnsi="Arial Narrow"/>
+                <w:b/>
+              </w:rPr>
+              <w:t>: {</w:t>
+            </w:r>
+            <w:proofErr w:type="spellStart"/>
+            <w:r>
+              <w:rPr>
+                <w:rFonts w:ascii="Arial Narrow" w:hAnsi="Arial Narrow"/>
+                <w:b/>
+              </w:rPr>
+              <w:t>supportSoundSystemCount</w:t>
+            </w:r>
+            <w:proofErr w:type="spellEnd"/>
+            <w:r>
+              <w:rPr>
+                <w:rFonts w:ascii="Arial Narrow" w:hAnsi="Arial Narrow"/>
+                <w:b/>
+              </w:rPr>
+              <w:t>} PCS</w:t>
+            </w:r>
           </w:p>
         </w:tc>
         <w:tc>
@@ -3747,6 +3860,7 @@
               </w:rPr>
               <w:t xml:space="preserve">}) </w:t>
             </w:r>
+            <w:proofErr w:type="gramStart"/>
             <w:r>
               <w:rPr>
                 <w:rFonts w:ascii="Arial Narrow" w:hAnsi="Arial Narrow"/>
@@ -3759,7 +3873,31 @@
                 <w:rFonts w:ascii="Arial Narrow" w:hAnsi="Arial Narrow"/>
                 <w:b/>
               </w:rPr>
-              <w:t>: 3 PCS</w:t>
+              <w:t xml:space="preserve">: </w:t>
+            </w:r>
+            <w:r>
+              <w:rPr>
+                <w:rFonts w:ascii="Arial Narrow" w:hAnsi="Arial Narrow"/>
+                <w:b/>
+              </w:rPr>
+              <w:t>{</w:t>
+            </w:r>
+            <w:proofErr w:type="spellStart"/>
+            <w:proofErr w:type="gramEnd"/>
+            <w:r>
+              <w:rPr>
+                <w:rFonts w:ascii="Arial Narrow" w:hAnsi="Arial Narrow"/>
+                <w:b/>
+              </w:rPr>
+              <w:t>supportMicrophoneCount</w:t>
+            </w:r>
+            <w:proofErr w:type="spellEnd"/>
+            <w:r>
+              <w:rPr>
+                <w:rFonts w:ascii="Arial Narrow" w:hAnsi="Arial Narrow"/>
+                <w:b/>
+              </w:rPr>
+              <w:t>} PCS</w:t>
             </w:r>
           </w:p>
         </w:tc>
@@ -3808,7 +3946,39 @@
                 <w:rFonts w:ascii="Arial Narrow" w:hAnsi="Arial Narrow"/>
                 <w:b/>
               </w:rPr>
-              <w:t>LCD PROJECTOR</w:t>
+              <w:t xml:space="preserve">LCD </w:t>
+            </w:r>
+            <w:proofErr w:type="gramStart"/>
+            <w:r>
+              <w:rPr>
+                <w:rFonts w:ascii="Arial Narrow" w:hAnsi="Arial Narrow"/>
+                <w:b/>
+              </w:rPr>
+              <w:t>PROJECTOR</w:t>
+            </w:r>
+            <w:r>
+              <w:rPr>
+                <w:rFonts w:ascii="Arial Narrow" w:hAnsi="Arial Narrow"/>
+                <w:b/>
+              </w:rPr>
+              <w:t>: {</w:t>
+            </w:r>
+            <w:proofErr w:type="spellStart"/>
+            <w:proofErr w:type="gramEnd"/>
+            <w:r>
+              <w:rPr>
+                <w:rFonts w:ascii="Arial Narrow" w:hAnsi="Arial Narrow"/>
+                <w:b/>
+              </w:rPr>
+              <w:t>supportLCdProjectorCount</w:t>
+            </w:r>
+            <w:proofErr w:type="spellEnd"/>
+            <w:r>
+              <w:rPr>
+                <w:rFonts w:ascii="Arial Narrow" w:hAnsi="Arial Narrow"/>
+                <w:b/>
+              </w:rPr>
+              <w:t>} PCS</w:t>
             </w:r>
           </w:p>
         </w:tc>
@@ -3863,11 +4033,9 @@
                 <w:rFonts w:ascii="Arial Narrow" w:hAnsi="Arial Narrow"/>
                 <w:b/>
               </w:rPr>
-              <w:t xml:space="preserve"> One (1) LONG</w:t>
-            </w:r>
-            <w:r>
               <w:t xml:space="preserve"> </w:t>
             </w:r>
+            <w:proofErr w:type="gramStart"/>
             <w:r>
               <w:rPr>
                 <w:rFonts w:ascii="Arial Narrow" w:hAnsi="Arial Narrow"/>
@@ -3876,7 +4044,34 @@
               <w:t>TABLE</w:t>
             </w:r>
             <w:r>
-              <w:t xml:space="preserve">  </w:t>
+              <w:rPr>
+                <w:rFonts w:ascii="Arial Narrow" w:hAnsi="Arial Narrow"/>
+                <w:b/>
+              </w:rPr>
+              <w:t>S: {</w:t>
+            </w:r>
+            <w:proofErr w:type="spellStart"/>
+            <w:proofErr w:type="gramEnd"/>
+            <w:r>
+              <w:rPr>
+                <w:rFonts w:ascii="Arial Narrow" w:hAnsi="Arial Narrow"/>
+                <w:b/>
+              </w:rPr>
+              <w:t>supportTableCount</w:t>
+            </w:r>
+            <w:proofErr w:type="spellEnd"/>
+            <w:r>
+              <w:rPr>
+                <w:rFonts w:ascii="Arial Narrow" w:hAnsi="Arial Narrow"/>
+                <w:b/>
+              </w:rPr>
+              <w:t>} PCS</w:t>
+            </w:r>
+            <w:r>
+              <w:rPr>
+                <w:b/>
+              </w:rPr>
+              <w:t xml:space="preserve"> </w:t>
             </w:r>
           </w:p>
         </w:tc>
@@ -3890,52 +4085,74 @@
             <w:pPr>
               <w:spacing w:after="0"/>
               <w:rPr>
-                <w:rFonts w:ascii="Arial Narrow" w:hAnsi="Arial Narrow"/>
-                <w:b/>
-              </w:rPr>
-            </w:pPr>
-            <w:r>
-              <w:rPr>
-                <w:rFonts w:ascii="Arial Narrow" w:hAnsi="Arial Narrow"/>
-                <w:b/>
-              </w:rPr>
-              <w:t>OTHERS:</w:t>
-            </w:r>
-            <w:r>
-              <w:rPr>
-                <w:rFonts w:ascii="Arial Narrow" w:hAnsi="Arial Narrow"/>
-                <w:b/>
-              </w:rPr>
-              <w:t xml:space="preserve"> {</w:t>
-            </w:r>
-            <w:proofErr w:type="spellStart"/>
-            <w:r>
-              <w:rPr>
-                <w:rFonts w:ascii="Arial Narrow" w:hAnsi="Arial Narrow"/>
-                <w:b/>
-              </w:rPr>
-              <w:t>otherSupport</w:t>
-            </w:r>
-            <w:proofErr w:type="spellEnd"/>
-            <w:r>
-              <w:rPr>
-                <w:rFonts w:ascii="Arial Narrow" w:hAnsi="Arial Narrow"/>
-                <w:b/>
-              </w:rPr>
-              <w:t>}</w:t>
-            </w:r>
-          </w:p>
-          <w:p>
-            <w:pPr>
-              <w:spacing w:after="0"/>
-              <w:jc w:val="both"/>
-              <w:rPr>
                 <w:rFonts w:ascii="Century Gothic" w:hAnsi="Century Gothic"/>
                 <w:b/>
                 <w:color w:val="ED7D31" w:themeColor="accent2"/>
                 <w:sz w:val="20"/>
               </w:rPr>
             </w:pPr>
+            <w:r>
+              <w:rPr>
+                <w:rFonts w:ascii="Arial Narrow" w:hAnsi="Arial Narrow"/>
+                <w:b/>
+              </w:rPr>
+              <w:t>({</w:t>
+            </w:r>
+            <w:proofErr w:type="spellStart"/>
+            <w:r>
+              <w:rPr>
+                <w:rFonts w:ascii="Arial Narrow" w:hAnsi="Arial Narrow"/>
+                <w:b/>
+              </w:rPr>
+              <w:t>support</w:t>
+            </w:r>
+            <w:r>
+              <w:rPr>
+                <w:rFonts w:ascii="Arial Narrow" w:hAnsi="Arial Narrow"/>
+                <w:b/>
+              </w:rPr>
+              <w:t>Chairs</w:t>
+            </w:r>
+            <w:proofErr w:type="spellEnd"/>
+            <w:r>
+              <w:rPr>
+                <w:rFonts w:ascii="Arial Narrow" w:hAnsi="Arial Narrow"/>
+                <w:b/>
+              </w:rPr>
+              <w:t>})</w:t>
+            </w:r>
+            <w:r>
+              <w:rPr>
+                <w:rFonts w:ascii="Arial Narrow" w:hAnsi="Arial Narrow"/>
+                <w:b/>
+              </w:rPr>
+              <w:t xml:space="preserve"> </w:t>
+            </w:r>
+            <w:proofErr w:type="gramStart"/>
+            <w:r>
+              <w:rPr>
+                <w:rFonts w:ascii="Arial Narrow" w:hAnsi="Arial Narrow"/>
+                <w:b/>
+              </w:rPr>
+              <w:t>CHAIRS: {</w:t>
+            </w:r>
+            <w:proofErr w:type="spellStart"/>
+            <w:proofErr w:type="gramEnd"/>
+            <w:r>
+              <w:rPr>
+                <w:rFonts w:ascii="Arial Narrow" w:hAnsi="Arial Narrow"/>
+                <w:b/>
+              </w:rPr>
+              <w:t>supportChairsCount</w:t>
+            </w:r>
+            <w:proofErr w:type="spellEnd"/>
+            <w:r>
+              <w:rPr>
+                <w:rFonts w:ascii="Arial Narrow" w:hAnsi="Arial Narrow"/>
+                <w:b/>
+              </w:rPr>
+              <w:t>} PCS</w:t>
+            </w:r>
           </w:p>
         </w:tc>
         <w:tc>
@@ -3955,14 +4172,60 @@
                 <w:rFonts w:ascii="Arial Narrow" w:hAnsi="Arial Narrow"/>
                 <w:b/>
               </w:rPr>
-              <w:t>PROVISION FOR STUDENTS WITH DIVERSE NEEDS:</w:t>
-            </w:r>
-            <w:r>
-              <w:rPr>
-                <w:rFonts w:ascii="Arial Narrow" w:hAnsi="Arial Narrow"/>
-                <w:b/>
-              </w:rPr>
-              <w:t xml:space="preserve"> {</w:t>
+              <w:t>OTHERS: {</w:t>
+            </w:r>
+            <w:proofErr w:type="spellStart"/>
+            <w:r>
+              <w:rPr>
+                <w:rFonts w:ascii="Arial Narrow" w:hAnsi="Arial Narrow"/>
+                <w:b/>
+              </w:rPr>
+              <w:t>otherSupport</w:t>
+            </w:r>
+            <w:proofErr w:type="spellEnd"/>
+            <w:r>
+              <w:rPr>
+                <w:rFonts w:ascii="Arial Narrow" w:hAnsi="Arial Narrow"/>
+                <w:b/>
+              </w:rPr>
+              <w:t>}</w:t>
+            </w:r>
+          </w:p>
+          <w:p>
+            <w:pPr>
+              <w:spacing w:after="0"/>
+              <w:rPr>
+                <w:rFonts w:ascii="Arial Narrow" w:hAnsi="Arial Narrow"/>
+                <w:b/>
+              </w:rPr>
+            </w:pPr>
+          </w:p>
+        </w:tc>
+      </w:tr>
+      <w:tr>
+        <w:trPr>
+          <w:gridAfter w:val="1"/>
+          <w:wAfter w:w="4674" w:type="dxa"/>
+          <w:trHeight w:val="804"/>
+        </w:trPr>
+        <w:tc>
+          <w:tcPr>
+            <w:tcW w:w="4676" w:type="dxa"/>
+          </w:tcPr>
+          <w:p>
+            <w:pPr>
+              <w:spacing w:after="0"/>
+              <w:rPr>
+                <w:rFonts w:ascii="Arial Narrow" w:hAnsi="Arial Narrow"/>
+                <w:b/>
+              </w:rPr>
+            </w:pPr>
+            <w:r>
+              <w:rPr>
+                <w:rFonts w:ascii="Arial Narrow" w:hAnsi="Arial Narrow"/>
+                <w:b/>
+              </w:rPr>
+              <w:t>PROVISION FOR STUDENTS WITH DIVERSE NEEDS: {</w:t>
             </w:r>
             <w:proofErr w:type="spellStart"/>
             <w:r>
@@ -4401,6 +4664,7 @@
                 <w:color w:val="ED7D31" w:themeColor="accent2"/>
                 <w:sz w:val="20"/>
               </w:rPr>
+              <w:lastRenderedPageBreak/>
               <w:t>Remarks:</w:t>
             </w:r>
             <w:r>
@@ -4468,13 +4732,22 @@
                 <w:rFonts w:ascii="Arial Narrow" w:hAnsi="Arial Narrow" w:cs="Arial"/>
                 <w:b/>
               </w:rPr>
-              <w:t xml:space="preserve">Medical Exam Request: </w:t>
-            </w:r>
+              <w:lastRenderedPageBreak/>
+              <w:t>Medical Exam Request</w:t>
+            </w:r>
+            <w:proofErr w:type="gramStart"/>
             <w:r>
               <w:rPr>
                 <w:rFonts w:ascii="Arial Narrow" w:hAnsi="Arial Narrow" w:cs="Arial"/>
                 <w:b/>
               </w:rPr>
+              <w:t xml:space="preserve">: </w:t>
+            </w:r>
+            <w:r>
+              <w:rPr>
+                <w:rFonts w:ascii="Arial Narrow" w:hAnsi="Arial Narrow" w:cs="Arial"/>
+                <w:b/>
+              </w:rPr>
               <w:t>({</w:t>
             </w:r>
             <w:proofErr w:type="spellStart"/>
@@ -4493,6 +4766,7 @@
               </w:rPr>
               <w:t>})</w:t>
             </w:r>
+            <w:proofErr w:type="gramEnd"/>
             <w:r>
               <w:rPr>
                 <w:rFonts w:ascii="Arial Narrow" w:hAnsi="Arial Narrow" w:cs="Arial"/>
@@ -4524,6 +4798,7 @@
               <w:t>{</w:t>
             </w:r>
             <w:proofErr w:type="spellStart"/>
+            <w:proofErr w:type="gramStart"/>
             <w:r>
               <w:rPr>
                 <w:rFonts w:ascii="Arial Narrow" w:hAnsi="Arial Narrow" w:cs="Arial"/>
@@ -4539,6 +4814,7 @@
               </w:rPr>
               <w:t>})</w:t>
             </w:r>
+            <w:proofErr w:type="gramEnd"/>
             <w:r>
               <w:rPr>
                 <w:rFonts w:ascii="Arial Narrow" w:hAnsi="Arial Narrow" w:cs="Arial"/>
@@ -4623,6 +4899,7 @@
               <w:t>{</w:t>
             </w:r>
             <w:proofErr w:type="spellStart"/>
+            <w:proofErr w:type="gramStart"/>
             <w:r>
               <w:rPr>
                 <w:rFonts w:ascii="Arial Narrow" w:hAnsi="Arial Narrow" w:cs="Arial"/>
@@ -4638,6 +4915,7 @@
               </w:rPr>
               <w:t>})</w:t>
             </w:r>
+            <w:proofErr w:type="gramEnd"/>
             <w:r>
               <w:rPr>
                 <w:rFonts w:ascii="Arial Narrow" w:hAnsi="Arial Narrow" w:cs="Arial"/>
@@ -4676,6 +4954,7 @@
               <w:t>{</w:t>
             </w:r>
             <w:proofErr w:type="spellStart"/>
+            <w:proofErr w:type="gramStart"/>
             <w:r>
               <w:rPr>
                 <w:rFonts w:ascii="Arial Narrow" w:hAnsi="Arial Narrow" w:cs="Arial"/>
@@ -4691,6 +4970,7 @@
               </w:rPr>
               <w:t>})</w:t>
             </w:r>
+            <w:proofErr w:type="gramEnd"/>
             <w:r>
               <w:rPr>
                 <w:rFonts w:ascii="Arial Narrow" w:hAnsi="Arial Narrow" w:cs="Arial"/>
@@ -4789,7 +5069,6 @@
           <w:color w:val="ED7D31" w:themeColor="accent2"/>
           <w:sz w:val="20"/>
         </w:rPr>
-        <w:lastRenderedPageBreak/>
         <w:t>Part 5</w:t>
       </w:r>
       <w:r>

</xml_diff>

<commit_message>
Linked amenities and equipment
</commit_message>
<xml_diff>
--- a/public/templates/student-activity-proposal-form-v2.docx
+++ b/public/templates/student-activity-proposal-form-v2.docx
@@ -211,7 +211,7 @@
           <w:szCs w:val="28"/>
         </w:rPr>
         <w:drawing>
-          <wp:anchor distT="0" distB="0" distL="114300" distR="114300" simplePos="0" relativeHeight="251665408" behindDoc="0" locked="0" layoutInCell="1" allowOverlap="1" wp14:anchorId="4D66C737" wp14:editId="6C3A2E0A">
+          <wp:anchor distT="0" distB="0" distL="114300" distR="114300" simplePos="0" relativeHeight="251665408" behindDoc="0" locked="0" layoutInCell="1" allowOverlap="1" wp14:anchorId="4D66C737" wp14:editId="2ACAB8B8">
             <wp:simplePos x="0" y="0"/>
             <wp:positionH relativeFrom="column">
               <wp:posOffset>190004</wp:posOffset>
@@ -276,7 +276,7 @@
           <w:szCs w:val="28"/>
         </w:rPr>
         <w:drawing>
-          <wp:anchor distT="0" distB="0" distL="114300" distR="114300" simplePos="0" relativeHeight="251659264" behindDoc="0" locked="0" layoutInCell="1" allowOverlap="1" wp14:anchorId="31EB85D4" wp14:editId="29FD0F21">
+          <wp:anchor distT="0" distB="0" distL="114300" distR="114300" simplePos="0" relativeHeight="251659264" behindDoc="0" locked="0" layoutInCell="1" allowOverlap="1" wp14:anchorId="31EB85D4" wp14:editId="5C2C4E75">
             <wp:simplePos x="0" y="0"/>
             <wp:positionH relativeFrom="column">
               <wp:posOffset>-474914</wp:posOffset>
@@ -3290,6 +3290,861 @@
     <w:p>
       <w:pPr>
         <w:spacing w:after="0"/>
+        <w:jc w:val="both"/>
+        <w:rPr>
+          <w:rFonts w:ascii="Century Gothic" w:hAnsi="Century Gothic"/>
+          <w:b/>
+          <w:color w:val="ED7D31" w:themeColor="accent2"/>
+          <w:sz w:val="20"/>
+        </w:rPr>
+      </w:pPr>
+    </w:p>
+    <w:tbl>
+      <w:tblPr>
+        <w:tblStyle w:val="TableGrid"/>
+        <w:tblW w:w="0" w:type="auto"/>
+        <w:tblLook w:val="04A0" w:firstRow="1" w:lastRow="0" w:firstColumn="1" w:lastColumn="0" w:noHBand="0" w:noVBand="1"/>
+      </w:tblPr>
+      <w:tblGrid>
+        <w:gridCol w:w="4675"/>
+        <w:gridCol w:w="4675"/>
+      </w:tblGrid>
+      <w:tr>
+        <w:tc>
+          <w:tcPr>
+            <w:tcW w:w="4675" w:type="dxa"/>
+          </w:tcPr>
+          <w:p>
+            <w:pPr>
+              <w:spacing w:after="0"/>
+              <w:jc w:val="both"/>
+              <w:rPr>
+                <w:rFonts w:ascii="Century Gothic" w:hAnsi="Century Gothic"/>
+                <w:b/>
+                <w:color w:val="ED7D31" w:themeColor="accent2"/>
+                <w:sz w:val="20"/>
+              </w:rPr>
+            </w:pPr>
+            <w:r>
+              <w:rPr>
+                <w:rFonts w:ascii="Arial Narrow" w:hAnsi="Arial Narrow"/>
+                <w:b/>
+              </w:rPr>
+              <w:t>({</w:t>
+            </w:r>
+            <w:proofErr w:type="spellStart"/>
+            <w:r>
+              <w:rPr>
+                <w:rFonts w:ascii="Arial Narrow" w:hAnsi="Arial Narrow"/>
+                <w:b/>
+              </w:rPr>
+              <w:t>supportBudget</w:t>
+            </w:r>
+            <w:proofErr w:type="spellEnd"/>
+            <w:r>
+              <w:rPr>
+                <w:rFonts w:ascii="Arial Narrow" w:hAnsi="Arial Narrow"/>
+                <w:b/>
+              </w:rPr>
+              <w:t xml:space="preserve">}) </w:t>
+            </w:r>
+            <w:proofErr w:type="gramStart"/>
+            <w:r>
+              <w:rPr>
+                <w:rFonts w:ascii="Arial Narrow" w:hAnsi="Arial Narrow"/>
+                <w:b/>
+              </w:rPr>
+              <w:t>BUDGET: {</w:t>
+            </w:r>
+            <w:proofErr w:type="spellStart"/>
+            <w:proofErr w:type="gramEnd"/>
+            <w:r>
+              <w:rPr>
+                <w:rFonts w:ascii="Arial Narrow" w:hAnsi="Arial Narrow"/>
+                <w:b/>
+              </w:rPr>
+              <w:t>budgetDetails</w:t>
+            </w:r>
+            <w:proofErr w:type="spellEnd"/>
+            <w:r>
+              <w:rPr>
+                <w:rFonts w:ascii="Arial Narrow" w:hAnsi="Arial Narrow"/>
+                <w:b/>
+              </w:rPr>
+              <w:t>}</w:t>
+            </w:r>
+          </w:p>
+        </w:tc>
+        <w:tc>
+          <w:tcPr>
+            <w:tcW w:w="4675" w:type="dxa"/>
+          </w:tcPr>
+          <w:p>
+            <w:pPr>
+              <w:spacing w:after="0"/>
+              <w:rPr>
+                <w:rFonts w:ascii="Arial Narrow" w:hAnsi="Arial Narrow"/>
+                <w:b/>
+              </w:rPr>
+            </w:pPr>
+            <w:r>
+              <w:rPr>
+                <w:rFonts w:ascii="Arial Narrow" w:hAnsi="Arial Narrow"/>
+                <w:b/>
+              </w:rPr>
+              <w:t>({</w:t>
+            </w:r>
+            <w:proofErr w:type="spellStart"/>
+            <w:r>
+              <w:rPr>
+                <w:rFonts w:ascii="Arial Narrow" w:hAnsi="Arial Narrow"/>
+                <w:b/>
+              </w:rPr>
+              <w:t>supportVehicle</w:t>
+            </w:r>
+            <w:proofErr w:type="spellEnd"/>
+            <w:r>
+              <w:rPr>
+                <w:rFonts w:ascii="Arial Narrow" w:hAnsi="Arial Narrow"/>
+                <w:b/>
+              </w:rPr>
+              <w:t xml:space="preserve">}) </w:t>
+            </w:r>
+            <w:r>
+              <w:rPr>
+                <w:rFonts w:ascii="Arial Narrow" w:hAnsi="Arial Narrow"/>
+                <w:b/>
+              </w:rPr>
+              <w:t>VEHICLE</w:t>
+            </w:r>
+          </w:p>
+          <w:p>
+            <w:pPr>
+              <w:spacing w:after="0"/>
+              <w:rPr>
+                <w:rFonts w:ascii="Arial Narrow" w:hAnsi="Arial Narrow"/>
+                <w:b/>
+              </w:rPr>
+            </w:pPr>
+            <w:r>
+              <w:rPr>
+                <w:rFonts w:ascii="Arial Narrow" w:hAnsi="Arial Narrow"/>
+                <w:b/>
+              </w:rPr>
+              <w:t>NO. OF PASSENGER/S:</w:t>
+            </w:r>
+            <w:r>
+              <w:rPr>
+                <w:rFonts w:ascii="Arial Narrow" w:hAnsi="Arial Narrow"/>
+                <w:b/>
+              </w:rPr>
+              <w:t xml:space="preserve"> </w:t>
+            </w:r>
+            <w:r>
+              <w:rPr>
+                <w:rFonts w:ascii="Arial Narrow" w:hAnsi="Arial Narrow"/>
+                <w:b/>
+                <w:u w:val="single"/>
+              </w:rPr>
+              <w:t>{</w:t>
+            </w:r>
+            <w:proofErr w:type="spellStart"/>
+            <w:r>
+              <w:rPr>
+                <w:rFonts w:ascii="Arial Narrow" w:hAnsi="Arial Narrow"/>
+                <w:b/>
+                <w:u w:val="single"/>
+              </w:rPr>
+              <w:t>vehiclePassengers</w:t>
+            </w:r>
+            <w:proofErr w:type="spellEnd"/>
+            <w:r>
+              <w:rPr>
+                <w:rFonts w:ascii="Arial Narrow" w:hAnsi="Arial Narrow"/>
+                <w:b/>
+                <w:u w:val="single"/>
+              </w:rPr>
+              <w:t>}</w:t>
+            </w:r>
+          </w:p>
+          <w:p>
+            <w:pPr>
+              <w:spacing w:after="0"/>
+              <w:jc w:val="both"/>
+              <w:rPr>
+                <w:rFonts w:ascii="Century Gothic" w:hAnsi="Century Gothic"/>
+                <w:b/>
+                <w:color w:val="ED7D31" w:themeColor="accent2"/>
+                <w:sz w:val="20"/>
+              </w:rPr>
+            </w:pPr>
+            <w:r>
+              <w:rPr>
+                <w:rFonts w:ascii="Arial Narrow" w:hAnsi="Arial Narrow"/>
+                <w:b/>
+              </w:rPr>
+              <w:t xml:space="preserve">                                        </w:t>
+            </w:r>
+            <w:r>
+              <w:rPr>
+                <w:rFonts w:ascii="Arial Narrow" w:hAnsi="Arial Narrow"/>
+                <w:b/>
+                <w:i/>
+                <w:sz w:val="16"/>
+              </w:rPr>
+              <w:t xml:space="preserve"> </w:t>
+            </w:r>
+            <w:r>
+              <w:rPr>
+                <w:rFonts w:ascii="Arial Narrow" w:hAnsi="Arial Narrow"/>
+                <w:b/>
+                <w:i/>
+                <w:sz w:val="16"/>
+              </w:rPr>
+              <w:t xml:space="preserve">                  </w:t>
+            </w:r>
+            <w:r>
+              <w:rPr>
+                <w:rFonts w:ascii="Arial Narrow" w:hAnsi="Arial Narrow"/>
+                <w:i/>
+                <w:sz w:val="14"/>
+              </w:rPr>
+              <w:t>(PLS. SPECIFY)</w:t>
+            </w:r>
+          </w:p>
+        </w:tc>
+      </w:tr>
+      <w:tr>
+        <w:tc>
+          <w:tcPr>
+            <w:tcW w:w="4675" w:type="dxa"/>
+          </w:tcPr>
+          <w:p>
+            <w:pPr>
+              <w:spacing w:after="0"/>
+              <w:rPr>
+                <w:rFonts w:ascii="Arial Narrow" w:hAnsi="Arial Narrow"/>
+                <w:b/>
+              </w:rPr>
+            </w:pPr>
+            <w:r>
+              <w:rPr>
+                <w:rFonts w:ascii="Arial Narrow" w:hAnsi="Arial Narrow"/>
+                <w:b/>
+              </w:rPr>
+              <w:t>({</w:t>
+            </w:r>
+            <w:proofErr w:type="spellStart"/>
+            <w:r>
+              <w:rPr>
+                <w:rFonts w:ascii="Arial Narrow" w:hAnsi="Arial Narrow"/>
+                <w:b/>
+              </w:rPr>
+              <w:t>supportFoodSnacks</w:t>
+            </w:r>
+            <w:proofErr w:type="spellEnd"/>
+            <w:r>
+              <w:rPr>
+                <w:rFonts w:ascii="Arial Narrow" w:hAnsi="Arial Narrow"/>
+                <w:b/>
+              </w:rPr>
+              <w:t>})</w:t>
+            </w:r>
+            <w:r>
+              <w:rPr>
+                <w:rFonts w:ascii="Arial Narrow" w:hAnsi="Arial Narrow"/>
+                <w:b/>
+              </w:rPr>
+              <w:t xml:space="preserve"> </w:t>
+            </w:r>
+            <w:r>
+              <w:rPr>
+                <w:rFonts w:ascii="Arial Narrow" w:hAnsi="Arial Narrow"/>
+                <w:b/>
+              </w:rPr>
+              <w:t>FOOD/SNACKS</w:t>
+            </w:r>
+            <w:r>
+              <w:rPr>
+                <w:rFonts w:ascii="Arial Narrow" w:hAnsi="Arial Narrow"/>
+                <w:b/>
+              </w:rPr>
+              <w:t xml:space="preserve"> </w:t>
+            </w:r>
+            <w:r>
+              <w:rPr>
+                <w:rFonts w:ascii="Arial Narrow" w:hAnsi="Arial Narrow"/>
+                <w:b/>
+              </w:rPr>
+              <w:t xml:space="preserve">NO. OF </w:t>
+            </w:r>
+            <w:proofErr w:type="gramStart"/>
+            <w:r>
+              <w:rPr>
+                <w:rFonts w:ascii="Arial Narrow" w:hAnsi="Arial Narrow"/>
+                <w:b/>
+              </w:rPr>
+              <w:t>PAX:</w:t>
+            </w:r>
+            <w:r>
+              <w:rPr>
+                <w:rFonts w:ascii="Arial Narrow" w:hAnsi="Arial Narrow"/>
+                <w:b/>
+              </w:rPr>
+              <w:t xml:space="preserve"> </w:t>
+            </w:r>
+            <w:r>
+              <w:rPr>
+                <w:rFonts w:ascii="Arial Narrow" w:hAnsi="Arial Narrow"/>
+                <w:b/>
+                <w:u w:val="single"/>
+              </w:rPr>
+              <w:t>{</w:t>
+            </w:r>
+            <w:proofErr w:type="spellStart"/>
+            <w:proofErr w:type="gramEnd"/>
+            <w:r>
+              <w:rPr>
+                <w:rFonts w:ascii="Arial Narrow" w:hAnsi="Arial Narrow"/>
+                <w:b/>
+                <w:u w:val="single"/>
+              </w:rPr>
+              <w:t>foodPax</w:t>
+            </w:r>
+            <w:proofErr w:type="spellEnd"/>
+            <w:r>
+              <w:rPr>
+                <w:rFonts w:ascii="Arial Narrow" w:hAnsi="Arial Narrow"/>
+                <w:b/>
+                <w:u w:val="single"/>
+              </w:rPr>
+              <w:t>}</w:t>
+            </w:r>
+          </w:p>
+          <w:p>
+            <w:pPr>
+              <w:spacing w:after="0"/>
+              <w:jc w:val="both"/>
+              <w:rPr>
+                <w:rFonts w:ascii="Arial Narrow" w:hAnsi="Arial Narrow"/>
+                <w:b/>
+              </w:rPr>
+            </w:pPr>
+            <w:r>
+              <w:rPr>
+                <w:rFonts w:ascii="Arial Narrow" w:hAnsi="Arial Narrow"/>
+                <w:i/>
+                <w:sz w:val="14"/>
+              </w:rPr>
+              <w:t xml:space="preserve">                                                                                         </w:t>
+            </w:r>
+            <w:r>
+              <w:rPr>
+                <w:rFonts w:ascii="Arial Narrow" w:hAnsi="Arial Narrow"/>
+                <w:i/>
+                <w:sz w:val="14"/>
+              </w:rPr>
+              <w:t>(PLS. SPECIFY)</w:t>
+            </w:r>
+          </w:p>
+        </w:tc>
+        <w:tc>
+          <w:tcPr>
+            <w:tcW w:w="4675" w:type="dxa"/>
+          </w:tcPr>
+          <w:p>
+            <w:pPr>
+              <w:spacing w:after="0"/>
+              <w:rPr>
+                <w:rFonts w:ascii="Arial Narrow" w:hAnsi="Arial Narrow"/>
+                <w:b/>
+              </w:rPr>
+            </w:pPr>
+            <w:r>
+              <w:rPr>
+                <w:rFonts w:ascii="Arial Narrow" w:hAnsi="Arial Narrow"/>
+                <w:b/>
+              </w:rPr>
+              <w:t>({</w:t>
+            </w:r>
+            <w:proofErr w:type="spellStart"/>
+            <w:r>
+              <w:rPr>
+                <w:rFonts w:ascii="Arial Narrow" w:hAnsi="Arial Narrow"/>
+                <w:b/>
+              </w:rPr>
+              <w:t>supportRoomVenue</w:t>
+            </w:r>
+            <w:proofErr w:type="spellEnd"/>
+            <w:r>
+              <w:rPr>
+                <w:rFonts w:ascii="Arial Narrow" w:hAnsi="Arial Narrow"/>
+                <w:b/>
+              </w:rPr>
+              <w:t>})</w:t>
+            </w:r>
+            <w:r>
+              <w:rPr>
+                <w:rFonts w:ascii="Arial Narrow" w:hAnsi="Arial Narrow"/>
+                <w:b/>
+              </w:rPr>
+              <w:t xml:space="preserve"> </w:t>
+            </w:r>
+            <w:r>
+              <w:rPr>
+                <w:rFonts w:ascii="Arial Narrow" w:hAnsi="Arial Narrow"/>
+                <w:b/>
+              </w:rPr>
+              <w:t>ROOM/</w:t>
+            </w:r>
+            <w:proofErr w:type="gramStart"/>
+            <w:r>
+              <w:rPr>
+                <w:rFonts w:ascii="Arial Narrow" w:hAnsi="Arial Narrow"/>
+                <w:b/>
+              </w:rPr>
+              <w:t>VENUE</w:t>
+            </w:r>
+            <w:r>
+              <w:rPr>
+                <w:rFonts w:ascii="Arial Narrow" w:hAnsi="Arial Narrow"/>
+                <w:b/>
+              </w:rPr>
+              <w:t xml:space="preserve">: </w:t>
+            </w:r>
+            <w:r>
+              <w:rPr>
+                <w:rFonts w:ascii="Arial Narrow" w:hAnsi="Arial Narrow"/>
+                <w:b/>
+                <w:u w:val="single"/>
+              </w:rPr>
+              <w:t>{</w:t>
+            </w:r>
+            <w:proofErr w:type="spellStart"/>
+            <w:proofErr w:type="gramEnd"/>
+            <w:r>
+              <w:rPr>
+                <w:rFonts w:ascii="Arial Narrow" w:hAnsi="Arial Narrow"/>
+                <w:b/>
+                <w:u w:val="single"/>
+              </w:rPr>
+              <w:t>roomVenueDetails</w:t>
+            </w:r>
+            <w:proofErr w:type="spellEnd"/>
+            <w:r>
+              <w:rPr>
+                <w:rFonts w:ascii="Arial Narrow" w:hAnsi="Arial Narrow"/>
+                <w:b/>
+                <w:u w:val="single"/>
+              </w:rPr>
+              <w:t>}</w:t>
+            </w:r>
+          </w:p>
+          <w:p>
+            <w:pPr>
+              <w:spacing w:after="0"/>
+              <w:rPr>
+                <w:rFonts w:ascii="Arial Narrow" w:hAnsi="Arial Narrow"/>
+                <w:b/>
+              </w:rPr>
+            </w:pPr>
+            <w:r>
+              <w:rPr>
+                <w:rFonts w:ascii="Arial Narrow" w:hAnsi="Arial Narrow"/>
+                <w:i/>
+                <w:sz w:val="14"/>
+              </w:rPr>
+              <w:t xml:space="preserve">                                                                                    </w:t>
+            </w:r>
+            <w:r>
+              <w:rPr>
+                <w:rFonts w:ascii="Arial Narrow" w:hAnsi="Arial Narrow"/>
+                <w:i/>
+                <w:sz w:val="14"/>
+              </w:rPr>
+              <w:t>(PLS. SPECIFY)</w:t>
+            </w:r>
+          </w:p>
+        </w:tc>
+      </w:tr>
+    </w:tbl>
+    <w:p>
+      <w:pPr>
+        <w:spacing w:after="0"/>
+        <w:jc w:val="both"/>
+        <w:rPr>
+          <w:rFonts w:ascii="Century Gothic" w:hAnsi="Century Gothic"/>
+          <w:b/>
+          <w:color w:val="ED7D31" w:themeColor="accent2"/>
+          <w:sz w:val="20"/>
+        </w:rPr>
+      </w:pPr>
+      <w:r>
+        <w:rPr>
+          <w:rFonts w:ascii="Century Gothic" w:hAnsi="Century Gothic"/>
+          <w:b/>
+          <w:color w:val="ED7D31" w:themeColor="accent2"/>
+          <w:sz w:val="20"/>
+        </w:rPr>
+        <w:t>{#supportTableRows}</w:t>
+      </w:r>
+    </w:p>
+    <w:tbl>
+      <w:tblPr>
+        <w:tblStyle w:val="TableGrid"/>
+        <w:tblW w:w="0" w:type="auto"/>
+        <w:tblLook w:val="04A0" w:firstRow="1" w:lastRow="0" w:firstColumn="1" w:lastColumn="0" w:noHBand="0" w:noVBand="1"/>
+      </w:tblPr>
+      <w:tblGrid>
+        <w:gridCol w:w="4673"/>
+        <w:gridCol w:w="4677"/>
+      </w:tblGrid>
+      <w:tr>
+        <w:tc>
+          <w:tcPr>
+            <w:tcW w:w="4673" w:type="dxa"/>
+          </w:tcPr>
+          <w:p>
+            <w:pPr>
+              <w:spacing w:after="0"/>
+              <w:jc w:val="both"/>
+              <w:rPr>
+                <w:rFonts w:ascii="Arial Narrow" w:hAnsi="Arial Narrow"/>
+                <w:b/>
+              </w:rPr>
+            </w:pPr>
+            <w:r>
+              <w:rPr>
+                <w:rFonts w:ascii="Arial Narrow" w:hAnsi="Arial Narrow"/>
+                <w:b/>
+              </w:rPr>
+              <w:t>{</w:t>
+            </w:r>
+            <w:proofErr w:type="spellStart"/>
+            <w:r>
+              <w:rPr>
+                <w:rFonts w:ascii="Arial Narrow" w:hAnsi="Arial Narrow"/>
+                <w:b/>
+              </w:rPr>
+              <w:t>left</w:t>
+            </w:r>
+            <w:r>
+              <w:rPr>
+                <w:rFonts w:ascii="Arial Narrow" w:hAnsi="Arial Narrow"/>
+                <w:b/>
+              </w:rPr>
+              <w:t>Checked</w:t>
+            </w:r>
+            <w:proofErr w:type="spellEnd"/>
+            <w:r>
+              <w:rPr>
+                <w:rFonts w:ascii="Arial Narrow" w:hAnsi="Arial Narrow"/>
+                <w:b/>
+              </w:rPr>
+              <w:t xml:space="preserve">} </w:t>
+            </w:r>
+            <w:r>
+              <w:rPr>
+                <w:rFonts w:ascii="Arial Narrow" w:hAnsi="Arial Narrow"/>
+                <w:b/>
+              </w:rPr>
+              <w:t>{</w:t>
+            </w:r>
+            <w:proofErr w:type="spellStart"/>
+            <w:r>
+              <w:rPr>
+                <w:rFonts w:ascii="Arial Narrow" w:hAnsi="Arial Narrow"/>
+                <w:b/>
+              </w:rPr>
+              <w:t>left</w:t>
+            </w:r>
+            <w:r>
+              <w:rPr>
+                <w:rFonts w:ascii="Arial Narrow" w:hAnsi="Arial Narrow"/>
+                <w:b/>
+              </w:rPr>
+              <w:t>Name</w:t>
+            </w:r>
+            <w:proofErr w:type="spellEnd"/>
+            <w:r>
+              <w:rPr>
+                <w:rFonts w:ascii="Arial Narrow" w:hAnsi="Arial Narrow"/>
+                <w:b/>
+              </w:rPr>
+              <w:t>}</w:t>
+            </w:r>
+            <w:r>
+              <w:rPr>
+                <w:rFonts w:ascii="Arial Narrow" w:hAnsi="Arial Narrow"/>
+                <w:b/>
+              </w:rPr>
+              <w:t xml:space="preserve">: </w:t>
+            </w:r>
+            <w:r>
+              <w:rPr>
+                <w:rFonts w:ascii="Arial Narrow" w:hAnsi="Arial Narrow"/>
+                <w:b/>
+                <w:u w:val="single"/>
+              </w:rPr>
+              <w:t>{</w:t>
+            </w:r>
+            <w:proofErr w:type="spellStart"/>
+            <w:r>
+              <w:rPr>
+                <w:rFonts w:ascii="Arial Narrow" w:hAnsi="Arial Narrow"/>
+                <w:b/>
+                <w:u w:val="single"/>
+              </w:rPr>
+              <w:t>left</w:t>
+            </w:r>
+            <w:r>
+              <w:rPr>
+                <w:rFonts w:ascii="Arial Narrow" w:hAnsi="Arial Narrow"/>
+                <w:b/>
+                <w:u w:val="single"/>
+              </w:rPr>
+              <w:t>Quantity</w:t>
+            </w:r>
+            <w:proofErr w:type="spellEnd"/>
+            <w:r>
+              <w:rPr>
+                <w:rFonts w:ascii="Arial Narrow" w:hAnsi="Arial Narrow"/>
+                <w:b/>
+                <w:u w:val="single"/>
+              </w:rPr>
+              <w:t>}</w:t>
+            </w:r>
+          </w:p>
+          <w:p>
+            <w:pPr>
+              <w:spacing w:after="0"/>
+              <w:jc w:val="both"/>
+              <w:rPr>
+                <w:rFonts w:ascii="Arial Narrow" w:hAnsi="Arial Narrow"/>
+                <w:b/>
+              </w:rPr>
+            </w:pPr>
+            <w:r>
+              <w:rPr>
+                <w:rFonts w:ascii="Arial Narrow" w:hAnsi="Arial Narrow"/>
+                <w:b/>
+              </w:rPr>
+              <w:t xml:space="preserve">                                        </w:t>
+            </w:r>
+            <w:r>
+              <w:rPr>
+                <w:rFonts w:ascii="Arial Narrow" w:hAnsi="Arial Narrow"/>
+                <w:b/>
+                <w:i/>
+                <w:sz w:val="16"/>
+              </w:rPr>
+              <w:t xml:space="preserve"> </w:t>
+            </w:r>
+            <w:r>
+              <w:rPr>
+                <w:rFonts w:ascii="Arial Narrow" w:hAnsi="Arial Narrow"/>
+                <w:b/>
+                <w:i/>
+                <w:sz w:val="16"/>
+              </w:rPr>
+              <w:t xml:space="preserve">                  </w:t>
+            </w:r>
+            <w:r>
+              <w:rPr>
+                <w:rFonts w:ascii="Arial Narrow" w:hAnsi="Arial Narrow"/>
+                <w:i/>
+                <w:sz w:val="14"/>
+              </w:rPr>
+              <w:t>(PLS. SPECIFY)</w:t>
+            </w:r>
+          </w:p>
+        </w:tc>
+        <w:tc>
+          <w:tcPr>
+            <w:tcW w:w="4677" w:type="dxa"/>
+          </w:tcPr>
+          <w:p>
+            <w:pPr>
+              <w:spacing w:after="0"/>
+              <w:jc w:val="both"/>
+              <w:rPr>
+                <w:rFonts w:ascii="Arial Narrow" w:hAnsi="Arial Narrow"/>
+                <w:b/>
+                <w:u w:val="single"/>
+              </w:rPr>
+            </w:pPr>
+            <w:r>
+              <w:rPr>
+                <w:rFonts w:ascii="Arial Narrow" w:hAnsi="Arial Narrow"/>
+                <w:b/>
+              </w:rPr>
+              <w:t>{</w:t>
+            </w:r>
+            <w:proofErr w:type="spellStart"/>
+            <w:r>
+              <w:rPr>
+                <w:rFonts w:ascii="Arial Narrow" w:hAnsi="Arial Narrow"/>
+                <w:b/>
+              </w:rPr>
+              <w:t>right</w:t>
+            </w:r>
+            <w:r>
+              <w:rPr>
+                <w:rFonts w:ascii="Arial Narrow" w:hAnsi="Arial Narrow"/>
+                <w:b/>
+              </w:rPr>
+              <w:t>Checked</w:t>
+            </w:r>
+            <w:proofErr w:type="spellEnd"/>
+            <w:r>
+              <w:rPr>
+                <w:rFonts w:ascii="Arial Narrow" w:hAnsi="Arial Narrow"/>
+                <w:b/>
+              </w:rPr>
+              <w:t>} {</w:t>
+            </w:r>
+            <w:proofErr w:type="spellStart"/>
+            <w:r>
+              <w:rPr>
+                <w:rFonts w:ascii="Arial Narrow" w:hAnsi="Arial Narrow"/>
+                <w:b/>
+              </w:rPr>
+              <w:t>rightName</w:t>
+            </w:r>
+            <w:proofErr w:type="spellEnd"/>
+            <w:r>
+              <w:rPr>
+                <w:rFonts w:ascii="Arial Narrow" w:hAnsi="Arial Narrow"/>
+                <w:b/>
+              </w:rPr>
+              <w:t xml:space="preserve">}: </w:t>
+            </w:r>
+            <w:r>
+              <w:rPr>
+                <w:rFonts w:ascii="Arial Narrow" w:hAnsi="Arial Narrow"/>
+                <w:b/>
+                <w:u w:val="single"/>
+              </w:rPr>
+              <w:t>{</w:t>
+            </w:r>
+            <w:proofErr w:type="spellStart"/>
+            <w:r>
+              <w:rPr>
+                <w:rFonts w:ascii="Arial Narrow" w:hAnsi="Arial Narrow"/>
+                <w:b/>
+                <w:u w:val="single"/>
+              </w:rPr>
+              <w:t>right</w:t>
+            </w:r>
+            <w:r>
+              <w:rPr>
+                <w:rFonts w:ascii="Arial Narrow" w:hAnsi="Arial Narrow"/>
+                <w:b/>
+                <w:u w:val="single"/>
+              </w:rPr>
+              <w:t>Quantity</w:t>
+            </w:r>
+            <w:proofErr w:type="spellEnd"/>
+            <w:r>
+              <w:rPr>
+                <w:rFonts w:ascii="Arial Narrow" w:hAnsi="Arial Narrow"/>
+                <w:b/>
+                <w:u w:val="single"/>
+              </w:rPr>
+              <w:t>}</w:t>
+            </w:r>
+          </w:p>
+          <w:p>
+            <w:pPr>
+              <w:spacing w:after="0"/>
+              <w:jc w:val="both"/>
+              <w:rPr>
+                <w:rFonts w:ascii="Arial Narrow" w:hAnsi="Arial Narrow"/>
+                <w:b/>
+                <w:color w:val="ED7D31" w:themeColor="accent2"/>
+              </w:rPr>
+            </w:pPr>
+            <w:r>
+              <w:rPr>
+                <w:rFonts w:ascii="Arial Narrow" w:hAnsi="Arial Narrow"/>
+                <w:b/>
+              </w:rPr>
+              <w:t xml:space="preserve">                                        </w:t>
+            </w:r>
+            <w:r>
+              <w:rPr>
+                <w:rFonts w:ascii="Arial Narrow" w:hAnsi="Arial Narrow"/>
+                <w:b/>
+                <w:i/>
+                <w:sz w:val="16"/>
+              </w:rPr>
+              <w:t xml:space="preserve"> </w:t>
+            </w:r>
+            <w:r>
+              <w:rPr>
+                <w:rFonts w:ascii="Arial Narrow" w:hAnsi="Arial Narrow"/>
+                <w:b/>
+                <w:i/>
+                <w:sz w:val="16"/>
+              </w:rPr>
+              <w:t xml:space="preserve">                  </w:t>
+            </w:r>
+            <w:r>
+              <w:rPr>
+                <w:rFonts w:ascii="Arial Narrow" w:hAnsi="Arial Narrow"/>
+                <w:i/>
+                <w:sz w:val="14"/>
+              </w:rPr>
+              <w:t>(PLS. SPECIFY)</w:t>
+            </w:r>
+          </w:p>
+        </w:tc>
+      </w:tr>
+    </w:tbl>
+    <w:p>
+      <w:pPr>
+        <w:spacing w:after="0"/>
+        <w:jc w:val="both"/>
+        <w:rPr>
+          <w:rFonts w:ascii="Century Gothic" w:hAnsi="Century Gothic"/>
+          <w:b/>
+          <w:color w:val="ED7D31" w:themeColor="accent2"/>
+          <w:sz w:val="20"/>
+        </w:rPr>
+      </w:pPr>
+      <w:r>
+        <w:rPr>
+          <w:rFonts w:ascii="Century Gothic" w:hAnsi="Century Gothic"/>
+          <w:b/>
+          <w:color w:val="ED7D31" w:themeColor="accent2"/>
+          <w:sz w:val="20"/>
+        </w:rPr>
+        <w:t>{/</w:t>
+      </w:r>
+      <w:proofErr w:type="spellStart"/>
+      <w:r>
+        <w:rPr>
+          <w:rFonts w:ascii="Century Gothic" w:hAnsi="Century Gothic"/>
+          <w:b/>
+          <w:color w:val="ED7D31" w:themeColor="accent2"/>
+          <w:sz w:val="20"/>
+        </w:rPr>
+        <w:t>supportTableRows</w:t>
+      </w:r>
+      <w:proofErr w:type="spellEnd"/>
+      <w:r>
+        <w:rPr>
+          <w:rFonts w:ascii="Century Gothic" w:hAnsi="Century Gothic"/>
+          <w:b/>
+          <w:color w:val="ED7D31" w:themeColor="accent2"/>
+          <w:sz w:val="20"/>
+        </w:rPr>
+        <w:t>}</w:t>
+      </w:r>
+    </w:p>
+    <w:p>
+      <w:pPr>
+        <w:spacing w:after="0"/>
         <w:rPr>
           <w:rFonts w:ascii="Arial Narrow" w:hAnsi="Arial Narrow"/>
           <w:i/>
@@ -3345,9 +4200,18 @@
                 <w:rFonts w:ascii="Arial Narrow" w:hAnsi="Arial Narrow"/>
                 <w:b/>
               </w:rPr>
-              <w:t>}) BUDGET: {</w:t>
-            </w:r>
-            <w:proofErr w:type="spellStart"/>
+              <w:t xml:space="preserve">}) </w:t>
+            </w:r>
+            <w:proofErr w:type="gramStart"/>
+            <w:r>
+              <w:rPr>
+                <w:rFonts w:ascii="Arial Narrow" w:hAnsi="Arial Narrow"/>
+                <w:b/>
+              </w:rPr>
+              <w:t>BUDGET: {</w:t>
+            </w:r>
+            <w:proofErr w:type="spellStart"/>
+            <w:proofErr w:type="gramEnd"/>
             <w:r>
               <w:rPr>
                 <w:rFonts w:ascii="Arial Narrow" w:hAnsi="Arial Narrow"/>
@@ -4104,29 +4968,15 @@
                 <w:rFonts w:ascii="Arial Narrow" w:hAnsi="Arial Narrow"/>
                 <w:b/>
               </w:rPr>
-              <w:t>support</w:t>
-            </w:r>
-            <w:r>
-              <w:rPr>
-                <w:rFonts w:ascii="Arial Narrow" w:hAnsi="Arial Narrow"/>
-                <w:b/>
-              </w:rPr>
-              <w:t>Chairs</w:t>
-            </w:r>
-            <w:proofErr w:type="spellEnd"/>
-            <w:r>
-              <w:rPr>
-                <w:rFonts w:ascii="Arial Narrow" w:hAnsi="Arial Narrow"/>
-                <w:b/>
-              </w:rPr>
-              <w:t>})</w:t>
-            </w:r>
-            <w:r>
-              <w:rPr>
-                <w:rFonts w:ascii="Arial Narrow" w:hAnsi="Arial Narrow"/>
-                <w:b/>
-              </w:rPr>
-              <w:t xml:space="preserve"> </w:t>
+              <w:t>supportChairs</w:t>
+            </w:r>
+            <w:proofErr w:type="spellEnd"/>
+            <w:r>
+              <w:rPr>
+                <w:rFonts w:ascii="Arial Narrow" w:hAnsi="Arial Narrow"/>
+                <w:b/>
+              </w:rPr>
+              <w:t xml:space="preserve">}) </w:t>
             </w:r>
             <w:proofErr w:type="gramStart"/>
             <w:r>
@@ -4329,6 +5179,7 @@
           <w:bCs/>
           <w:sz w:val="20"/>
         </w:rPr>
+        <w:lastRenderedPageBreak/>
         <w:t>{</w:t>
       </w:r>
       <w:proofErr w:type="spellStart"/>
@@ -4664,7 +5515,6 @@
                 <w:color w:val="ED7D31" w:themeColor="accent2"/>
                 <w:sz w:val="20"/>
               </w:rPr>
-              <w:lastRenderedPageBreak/>
               <w:t>Remarks:</w:t>
             </w:r>
             <w:r>
@@ -4732,7 +5582,6 @@
                 <w:rFonts w:ascii="Arial Narrow" w:hAnsi="Arial Narrow" w:cs="Arial"/>
                 <w:b/>
               </w:rPr>
-              <w:lastRenderedPageBreak/>
               <w:t>Medical Exam Request</w:t>
             </w:r>
             <w:proofErr w:type="gramStart"/>
@@ -6297,6 +7146,7 @@
               <w:rPr>
                 <w:rFonts w:ascii="Arial Narrow" w:hAnsi="Arial Narrow"/>
               </w:rPr>
+              <w:lastRenderedPageBreak/>
               <w:t>Remarks: {</w:t>
             </w:r>
             <w:proofErr w:type="spellStart"/>
@@ -6467,11 +7317,15 @@
               <w:spacing w:after="0"/>
               <w:rPr>
                 <w:rFonts w:ascii="Arial Narrow" w:hAnsi="Arial Narrow"/>
-              </w:rPr>
-            </w:pPr>
-            <w:r>
-              <w:rPr>
-                <w:rFonts w:ascii="Arial Narrow" w:hAnsi="Arial Narrow"/>
+                <w:b/>
+                <w:bCs/>
+              </w:rPr>
+            </w:pPr>
+            <w:r>
+              <w:rPr>
+                <w:rFonts w:ascii="Arial Narrow" w:hAnsi="Arial Narrow"/>
+                <w:b/>
+                <w:bCs/>
               </w:rPr>
               <w:t>{</w:t>
             </w:r>
@@ -6479,6 +7333,8 @@
             <w:r>
               <w:rPr>
                 <w:rFonts w:ascii="Arial Narrow" w:hAnsi="Arial Narrow"/>
+                <w:b/>
+                <w:bCs/>
               </w:rPr>
               <w:t>historyComment</w:t>
             </w:r>
@@ -6486,6 +7342,8 @@
             <w:r>
               <w:rPr>
                 <w:rFonts w:ascii="Arial Narrow" w:hAnsi="Arial Narrow"/>
+                <w:b/>
+                <w:bCs/>
               </w:rPr>
               <w:t>}</w:t>
             </w:r>

</xml_diff>

<commit_message>
updated template of docx
</commit_message>
<xml_diff>
--- a/public/templates/student-activity-proposal-form-v2.docx
+++ b/public/templates/student-activity-proposal-form-v2.docx
@@ -3841,7 +3841,7 @@
                 <w:rFonts w:ascii="Arial Narrow" w:hAnsi="Arial Narrow"/>
                 <w:b/>
               </w:rPr>
-              <w:t xml:space="preserve">} </w:t>
+              <w:t>}</w:t>
             </w:r>
             <w:r>
               <w:rPr>
@@ -3913,49 +3913,6 @@
                 <w:u w:val="single"/>
               </w:rPr>
               <w:t>}</w:t>
-            </w:r>
-          </w:p>
-          <w:p>
-            <w:pPr>
-              <w:spacing w:after="0"/>
-              <w:jc w:val="both"/>
-              <w:rPr>
-                <w:rFonts w:ascii="Arial Narrow" w:hAnsi="Arial Narrow"/>
-                <w:b/>
-              </w:rPr>
-            </w:pPr>
-            <w:r>
-              <w:rPr>
-                <w:rFonts w:ascii="Arial Narrow" w:hAnsi="Arial Narrow"/>
-                <w:b/>
-              </w:rPr>
-              <w:t xml:space="preserve">                                        </w:t>
-            </w:r>
-            <w:r>
-              <w:rPr>
-                <w:rFonts w:ascii="Arial Narrow" w:hAnsi="Arial Narrow"/>
-                <w:b/>
-                <w:i/>
-                <w:sz w:val="16"/>
-              </w:rPr>
-              <w:t xml:space="preserve"> </w:t>
-            </w:r>
-            <w:r>
-              <w:rPr>
-                <w:rFonts w:ascii="Arial Narrow" w:hAnsi="Arial Narrow"/>
-                <w:b/>
-                <w:i/>
-                <w:sz w:val="16"/>
-              </w:rPr>
-              <w:t xml:space="preserve">                  </w:t>
-            </w:r>
-            <w:r>
-              <w:rPr>
-                <w:rFonts w:ascii="Arial Narrow" w:hAnsi="Arial Narrow"/>
-                <w:i/>
-                <w:sz w:val="14"/>
-              </w:rPr>
-              <w:t>(PLS. SPECIFY)</w:t>
             </w:r>
           </w:p>
         </w:tc>
@@ -4001,7 +3958,7 @@
                 <w:rFonts w:ascii="Arial Narrow" w:hAnsi="Arial Narrow"/>
                 <w:b/>
               </w:rPr>
-              <w:t>} {</w:t>
+              <w:t>}{</w:t>
             </w:r>
             <w:proofErr w:type="spellStart"/>
             <w:r>
@@ -4052,50 +4009,6 @@
                 <w:u w:val="single"/>
               </w:rPr>
               <w:t>}</w:t>
-            </w:r>
-          </w:p>
-          <w:p>
-            <w:pPr>
-              <w:spacing w:after="0"/>
-              <w:jc w:val="both"/>
-              <w:rPr>
-                <w:rFonts w:ascii="Arial Narrow" w:hAnsi="Arial Narrow"/>
-                <w:b/>
-                <w:color w:val="ED7D31" w:themeColor="accent2"/>
-              </w:rPr>
-            </w:pPr>
-            <w:r>
-              <w:rPr>
-                <w:rFonts w:ascii="Arial Narrow" w:hAnsi="Arial Narrow"/>
-                <w:b/>
-              </w:rPr>
-              <w:t xml:space="preserve">                                        </w:t>
-            </w:r>
-            <w:r>
-              <w:rPr>
-                <w:rFonts w:ascii="Arial Narrow" w:hAnsi="Arial Narrow"/>
-                <w:b/>
-                <w:i/>
-                <w:sz w:val="16"/>
-              </w:rPr>
-              <w:t xml:space="preserve"> </w:t>
-            </w:r>
-            <w:r>
-              <w:rPr>
-                <w:rFonts w:ascii="Arial Narrow" w:hAnsi="Arial Narrow"/>
-                <w:b/>
-                <w:i/>
-                <w:sz w:val="16"/>
-              </w:rPr>
-              <w:t xml:space="preserve">                  </w:t>
-            </w:r>
-            <w:r>
-              <w:rPr>
-                <w:rFonts w:ascii="Arial Narrow" w:hAnsi="Arial Narrow"/>
-                <w:i/>
-                <w:sz w:val="14"/>
-              </w:rPr>
-              <w:t>(PLS. SPECIFY)</w:t>
             </w:r>
           </w:p>
         </w:tc>
@@ -4145,961 +4058,6 @@
     <w:p>
       <w:pPr>
         <w:spacing w:after="0"/>
-        <w:rPr>
-          <w:rFonts w:ascii="Arial Narrow" w:hAnsi="Arial Narrow"/>
-          <w:i/>
-          <w:color w:val="FF0000"/>
-          <w:sz w:val="18"/>
-        </w:rPr>
-      </w:pPr>
-    </w:p>
-    <w:tbl>
-      <w:tblPr>
-        <w:tblStyle w:val="TableGrid"/>
-        <w:tblW w:w="0" w:type="auto"/>
-        <w:tblLook w:val="04A0" w:firstRow="1" w:lastRow="0" w:firstColumn="1" w:lastColumn="0" w:noHBand="0" w:noVBand="1"/>
-      </w:tblPr>
-      <w:tblGrid>
-        <w:gridCol w:w="4676"/>
-        <w:gridCol w:w="4674"/>
-      </w:tblGrid>
-      <w:tr>
-        <w:tc>
-          <w:tcPr>
-            <w:tcW w:w="4676" w:type="dxa"/>
-          </w:tcPr>
-          <w:p>
-            <w:pPr>
-              <w:spacing w:after="0"/>
-              <w:jc w:val="both"/>
-              <w:rPr>
-                <w:rFonts w:ascii="Century Gothic" w:hAnsi="Century Gothic"/>
-                <w:b/>
-                <w:color w:val="ED7D31" w:themeColor="accent2"/>
-                <w:sz w:val="20"/>
-              </w:rPr>
-            </w:pPr>
-            <w:r>
-              <w:rPr>
-                <w:rFonts w:ascii="Arial Narrow" w:hAnsi="Arial Narrow"/>
-                <w:b/>
-              </w:rPr>
-              <w:t>({</w:t>
-            </w:r>
-            <w:proofErr w:type="spellStart"/>
-            <w:r>
-              <w:rPr>
-                <w:rFonts w:ascii="Arial Narrow" w:hAnsi="Arial Narrow"/>
-                <w:b/>
-              </w:rPr>
-              <w:t>supportBudget</w:t>
-            </w:r>
-            <w:proofErr w:type="spellEnd"/>
-            <w:r>
-              <w:rPr>
-                <w:rFonts w:ascii="Arial Narrow" w:hAnsi="Arial Narrow"/>
-                <w:b/>
-              </w:rPr>
-              <w:t xml:space="preserve">}) </w:t>
-            </w:r>
-            <w:proofErr w:type="gramStart"/>
-            <w:r>
-              <w:rPr>
-                <w:rFonts w:ascii="Arial Narrow" w:hAnsi="Arial Narrow"/>
-                <w:b/>
-              </w:rPr>
-              <w:t>BUDGET: {</w:t>
-            </w:r>
-            <w:proofErr w:type="spellStart"/>
-            <w:proofErr w:type="gramEnd"/>
-            <w:r>
-              <w:rPr>
-                <w:rFonts w:ascii="Arial Narrow" w:hAnsi="Arial Narrow"/>
-                <w:b/>
-              </w:rPr>
-              <w:t>budgetDetails</w:t>
-            </w:r>
-            <w:proofErr w:type="spellEnd"/>
-            <w:r>
-              <w:rPr>
-                <w:rFonts w:ascii="Arial Narrow" w:hAnsi="Arial Narrow"/>
-                <w:b/>
-              </w:rPr>
-              <w:t>}</w:t>
-            </w:r>
-          </w:p>
-        </w:tc>
-        <w:tc>
-          <w:tcPr>
-            <w:tcW w:w="4674" w:type="dxa"/>
-          </w:tcPr>
-          <w:p>
-            <w:pPr>
-              <w:spacing w:after="0"/>
-              <w:rPr>
-                <w:rFonts w:ascii="Arial Narrow" w:hAnsi="Arial Narrow"/>
-                <w:b/>
-              </w:rPr>
-            </w:pPr>
-            <w:r>
-              <w:rPr>
-                <w:rFonts w:ascii="Arial Narrow" w:hAnsi="Arial Narrow"/>
-                <w:b/>
-              </w:rPr>
-              <w:t>({</w:t>
-            </w:r>
-            <w:proofErr w:type="spellStart"/>
-            <w:r>
-              <w:rPr>
-                <w:rFonts w:ascii="Arial Narrow" w:hAnsi="Arial Narrow"/>
-                <w:b/>
-              </w:rPr>
-              <w:t>supportVehicle</w:t>
-            </w:r>
-            <w:proofErr w:type="spellEnd"/>
-            <w:r>
-              <w:rPr>
-                <w:rFonts w:ascii="Arial Narrow" w:hAnsi="Arial Narrow"/>
-                <w:b/>
-              </w:rPr>
-              <w:t xml:space="preserve">}) </w:t>
-            </w:r>
-            <w:r>
-              <w:rPr>
-                <w:rFonts w:ascii="Arial Narrow" w:hAnsi="Arial Narrow"/>
-                <w:b/>
-              </w:rPr>
-              <w:t>VEHICLE</w:t>
-            </w:r>
-          </w:p>
-          <w:p>
-            <w:pPr>
-              <w:spacing w:after="0"/>
-              <w:rPr>
-                <w:rFonts w:ascii="Arial Narrow" w:hAnsi="Arial Narrow"/>
-                <w:b/>
-              </w:rPr>
-            </w:pPr>
-            <w:r>
-              <w:rPr>
-                <w:rFonts w:ascii="Arial Narrow" w:hAnsi="Arial Narrow"/>
-                <w:b/>
-              </w:rPr>
-              <w:t>NO. OF PASSENGER/S:</w:t>
-            </w:r>
-            <w:r>
-              <w:rPr>
-                <w:rFonts w:ascii="Arial Narrow" w:hAnsi="Arial Narrow"/>
-                <w:b/>
-              </w:rPr>
-              <w:t xml:space="preserve"> </w:t>
-            </w:r>
-            <w:r>
-              <w:rPr>
-                <w:rFonts w:ascii="Arial Narrow" w:hAnsi="Arial Narrow"/>
-                <w:b/>
-                <w:u w:val="single"/>
-              </w:rPr>
-              <w:t>{</w:t>
-            </w:r>
-            <w:proofErr w:type="spellStart"/>
-            <w:r>
-              <w:rPr>
-                <w:rFonts w:ascii="Arial Narrow" w:hAnsi="Arial Narrow"/>
-                <w:b/>
-                <w:u w:val="single"/>
-              </w:rPr>
-              <w:t>vehiclePassengers</w:t>
-            </w:r>
-            <w:proofErr w:type="spellEnd"/>
-            <w:r>
-              <w:rPr>
-                <w:rFonts w:ascii="Arial Narrow" w:hAnsi="Arial Narrow"/>
-                <w:b/>
-                <w:u w:val="single"/>
-              </w:rPr>
-              <w:t>}</w:t>
-            </w:r>
-          </w:p>
-          <w:p>
-            <w:pPr>
-              <w:spacing w:after="0"/>
-              <w:jc w:val="both"/>
-              <w:rPr>
-                <w:rFonts w:ascii="Century Gothic" w:hAnsi="Century Gothic"/>
-                <w:b/>
-                <w:color w:val="ED7D31" w:themeColor="accent2"/>
-                <w:sz w:val="20"/>
-              </w:rPr>
-            </w:pPr>
-            <w:r>
-              <w:rPr>
-                <w:rFonts w:ascii="Arial Narrow" w:hAnsi="Arial Narrow"/>
-                <w:b/>
-              </w:rPr>
-              <w:t xml:space="preserve">                                        </w:t>
-            </w:r>
-            <w:r>
-              <w:rPr>
-                <w:rFonts w:ascii="Arial Narrow" w:hAnsi="Arial Narrow"/>
-                <w:b/>
-                <w:i/>
-                <w:sz w:val="16"/>
-              </w:rPr>
-              <w:t xml:space="preserve"> </w:t>
-            </w:r>
-            <w:r>
-              <w:rPr>
-                <w:rFonts w:ascii="Arial Narrow" w:hAnsi="Arial Narrow"/>
-                <w:b/>
-                <w:i/>
-                <w:sz w:val="16"/>
-              </w:rPr>
-              <w:t xml:space="preserve">                  </w:t>
-            </w:r>
-            <w:r>
-              <w:rPr>
-                <w:rFonts w:ascii="Arial Narrow" w:hAnsi="Arial Narrow"/>
-                <w:i/>
-                <w:sz w:val="14"/>
-              </w:rPr>
-              <w:t>(PLS. SPECIFY)</w:t>
-            </w:r>
-          </w:p>
-        </w:tc>
-      </w:tr>
-      <w:tr>
-        <w:tc>
-          <w:tcPr>
-            <w:tcW w:w="4676" w:type="dxa"/>
-          </w:tcPr>
-          <w:p>
-            <w:pPr>
-              <w:spacing w:after="0"/>
-              <w:rPr>
-                <w:rFonts w:ascii="Arial Narrow" w:hAnsi="Arial Narrow"/>
-                <w:b/>
-              </w:rPr>
-            </w:pPr>
-            <w:r>
-              <w:rPr>
-                <w:rFonts w:ascii="Arial Narrow" w:hAnsi="Arial Narrow"/>
-                <w:b/>
-              </w:rPr>
-              <w:t>({</w:t>
-            </w:r>
-            <w:proofErr w:type="spellStart"/>
-            <w:r>
-              <w:rPr>
-                <w:rFonts w:ascii="Arial Narrow" w:hAnsi="Arial Narrow"/>
-                <w:b/>
-              </w:rPr>
-              <w:t>supportFoodSnacks</w:t>
-            </w:r>
-            <w:proofErr w:type="spellEnd"/>
-            <w:r>
-              <w:rPr>
-                <w:rFonts w:ascii="Arial Narrow" w:hAnsi="Arial Narrow"/>
-                <w:b/>
-              </w:rPr>
-              <w:t>})</w:t>
-            </w:r>
-            <w:r>
-              <w:rPr>
-                <w:rFonts w:ascii="Arial Narrow" w:hAnsi="Arial Narrow"/>
-                <w:b/>
-              </w:rPr>
-              <w:t xml:space="preserve"> </w:t>
-            </w:r>
-            <w:r>
-              <w:rPr>
-                <w:rFonts w:ascii="Arial Narrow" w:hAnsi="Arial Narrow"/>
-                <w:b/>
-              </w:rPr>
-              <w:t>FOOD/SNACKS</w:t>
-            </w:r>
-            <w:r>
-              <w:rPr>
-                <w:rFonts w:ascii="Arial Narrow" w:hAnsi="Arial Narrow"/>
-                <w:b/>
-              </w:rPr>
-              <w:t xml:space="preserve"> </w:t>
-            </w:r>
-            <w:r>
-              <w:rPr>
-                <w:rFonts w:ascii="Arial Narrow" w:hAnsi="Arial Narrow"/>
-                <w:b/>
-              </w:rPr>
-              <w:t>NO. OF PAX:</w:t>
-            </w:r>
-            <w:r>
-              <w:rPr>
-                <w:rFonts w:ascii="Arial Narrow" w:hAnsi="Arial Narrow"/>
-                <w:b/>
-              </w:rPr>
-              <w:t xml:space="preserve"> </w:t>
-            </w:r>
-            <w:r>
-              <w:rPr>
-                <w:rFonts w:ascii="Arial Narrow" w:hAnsi="Arial Narrow"/>
-                <w:b/>
-                <w:u w:val="single"/>
-              </w:rPr>
-              <w:t>{</w:t>
-            </w:r>
-            <w:proofErr w:type="spellStart"/>
-            <w:r>
-              <w:rPr>
-                <w:rFonts w:ascii="Arial Narrow" w:hAnsi="Arial Narrow"/>
-                <w:b/>
-                <w:u w:val="single"/>
-              </w:rPr>
-              <w:t>foodPax</w:t>
-            </w:r>
-            <w:proofErr w:type="spellEnd"/>
-            <w:r>
-              <w:rPr>
-                <w:rFonts w:ascii="Arial Narrow" w:hAnsi="Arial Narrow"/>
-                <w:b/>
-                <w:u w:val="single"/>
-              </w:rPr>
-              <w:t>}</w:t>
-            </w:r>
-          </w:p>
-          <w:p>
-            <w:pPr>
-              <w:spacing w:after="0"/>
-              <w:jc w:val="both"/>
-              <w:rPr>
-                <w:rFonts w:ascii="Century Gothic" w:hAnsi="Century Gothic"/>
-                <w:b/>
-                <w:color w:val="ED7D31" w:themeColor="accent2"/>
-                <w:sz w:val="20"/>
-              </w:rPr>
-            </w:pPr>
-            <w:r>
-              <w:rPr>
-                <w:rFonts w:ascii="Arial Narrow" w:hAnsi="Arial Narrow"/>
-                <w:i/>
-                <w:sz w:val="14"/>
-              </w:rPr>
-              <w:t xml:space="preserve">                                                                                         </w:t>
-            </w:r>
-            <w:r>
-              <w:rPr>
-                <w:rFonts w:ascii="Arial Narrow" w:hAnsi="Arial Narrow"/>
-                <w:i/>
-                <w:sz w:val="14"/>
-              </w:rPr>
-              <w:t>(PLS. SPECIFY)</w:t>
-            </w:r>
-          </w:p>
-        </w:tc>
-        <w:tc>
-          <w:tcPr>
-            <w:tcW w:w="4674" w:type="dxa"/>
-          </w:tcPr>
-          <w:p>
-            <w:pPr>
-              <w:spacing w:after="0"/>
-              <w:rPr>
-                <w:rFonts w:ascii="Arial Narrow" w:hAnsi="Arial Narrow"/>
-                <w:b/>
-              </w:rPr>
-            </w:pPr>
-            <w:r>
-              <w:rPr>
-                <w:rFonts w:ascii="Arial Narrow" w:hAnsi="Arial Narrow"/>
-                <w:b/>
-              </w:rPr>
-              <w:t>({</w:t>
-            </w:r>
-            <w:proofErr w:type="spellStart"/>
-            <w:r>
-              <w:rPr>
-                <w:rFonts w:ascii="Arial Narrow" w:hAnsi="Arial Narrow"/>
-                <w:b/>
-              </w:rPr>
-              <w:t>supportRoomVenue</w:t>
-            </w:r>
-            <w:proofErr w:type="spellEnd"/>
-            <w:r>
-              <w:rPr>
-                <w:rFonts w:ascii="Arial Narrow" w:hAnsi="Arial Narrow"/>
-                <w:b/>
-              </w:rPr>
-              <w:t>})</w:t>
-            </w:r>
-            <w:r>
-              <w:rPr>
-                <w:rFonts w:ascii="Arial Narrow" w:hAnsi="Arial Narrow"/>
-                <w:b/>
-              </w:rPr>
-              <w:t xml:space="preserve"> </w:t>
-            </w:r>
-            <w:r>
-              <w:rPr>
-                <w:rFonts w:ascii="Arial Narrow" w:hAnsi="Arial Narrow"/>
-                <w:b/>
-              </w:rPr>
-              <w:t>ROOM/VENUE</w:t>
-            </w:r>
-            <w:r>
-              <w:rPr>
-                <w:rFonts w:ascii="Arial Narrow" w:hAnsi="Arial Narrow"/>
-                <w:b/>
-              </w:rPr>
-              <w:t>:</w:t>
-            </w:r>
-            <w:r>
-              <w:rPr>
-                <w:rFonts w:ascii="Arial Narrow" w:hAnsi="Arial Narrow"/>
-                <w:b/>
-              </w:rPr>
-              <w:t xml:space="preserve"> </w:t>
-            </w:r>
-            <w:r>
-              <w:rPr>
-                <w:rFonts w:ascii="Arial Narrow" w:hAnsi="Arial Narrow"/>
-                <w:b/>
-                <w:u w:val="single"/>
-              </w:rPr>
-              <w:t>{</w:t>
-            </w:r>
-            <w:proofErr w:type="spellStart"/>
-            <w:r>
-              <w:rPr>
-                <w:rFonts w:ascii="Arial Narrow" w:hAnsi="Arial Narrow"/>
-                <w:b/>
-                <w:u w:val="single"/>
-              </w:rPr>
-              <w:t>roomVenueDetails</w:t>
-            </w:r>
-            <w:proofErr w:type="spellEnd"/>
-            <w:r>
-              <w:rPr>
-                <w:rFonts w:ascii="Arial Narrow" w:hAnsi="Arial Narrow"/>
-                <w:b/>
-                <w:u w:val="single"/>
-              </w:rPr>
-              <w:t>}</w:t>
-            </w:r>
-          </w:p>
-          <w:p>
-            <w:pPr>
-              <w:spacing w:after="0"/>
-              <w:jc w:val="both"/>
-              <w:rPr>
-                <w:rFonts w:ascii="Century Gothic" w:hAnsi="Century Gothic"/>
-                <w:b/>
-                <w:color w:val="ED7D31" w:themeColor="accent2"/>
-                <w:sz w:val="20"/>
-              </w:rPr>
-            </w:pPr>
-            <w:r>
-              <w:rPr>
-                <w:rFonts w:ascii="Arial Narrow" w:hAnsi="Arial Narrow"/>
-                <w:i/>
-                <w:sz w:val="14"/>
-              </w:rPr>
-              <w:t xml:space="preserve">                                                                                    </w:t>
-            </w:r>
-            <w:r>
-              <w:rPr>
-                <w:rFonts w:ascii="Arial Narrow" w:hAnsi="Arial Narrow"/>
-                <w:i/>
-                <w:sz w:val="14"/>
-              </w:rPr>
-              <w:t>(PLS. SPECIFY)</w:t>
-            </w:r>
-          </w:p>
-        </w:tc>
-      </w:tr>
-      <w:tr>
-        <w:tc>
-          <w:tcPr>
-            <w:tcW w:w="4676" w:type="dxa"/>
-          </w:tcPr>
-          <w:p>
-            <w:pPr>
-              <w:spacing w:after="0"/>
-              <w:jc w:val="both"/>
-              <w:rPr>
-                <w:rFonts w:ascii="Century Gothic" w:hAnsi="Century Gothic"/>
-                <w:b/>
-                <w:color w:val="ED7D31" w:themeColor="accent2"/>
-                <w:sz w:val="20"/>
-              </w:rPr>
-            </w:pPr>
-            <w:r>
-              <w:rPr>
-                <w:rFonts w:ascii="Arial Narrow" w:hAnsi="Arial Narrow"/>
-                <w:b/>
-              </w:rPr>
-              <w:t>({</w:t>
-            </w:r>
-            <w:proofErr w:type="spellStart"/>
-            <w:r>
-              <w:rPr>
-                <w:rFonts w:ascii="Arial Narrow" w:hAnsi="Arial Narrow"/>
-                <w:b/>
-              </w:rPr>
-              <w:t>supportSoundSystem</w:t>
-            </w:r>
-            <w:proofErr w:type="spellEnd"/>
-            <w:r>
-              <w:rPr>
-                <w:rFonts w:ascii="Arial Narrow" w:hAnsi="Arial Narrow"/>
-                <w:b/>
-              </w:rPr>
-              <w:t xml:space="preserve">}) </w:t>
-            </w:r>
-            <w:r>
-              <w:rPr>
-                <w:rFonts w:ascii="Arial Narrow" w:hAnsi="Arial Narrow"/>
-                <w:b/>
-              </w:rPr>
-              <w:t>SOUND SYSTEM</w:t>
-            </w:r>
-            <w:r>
-              <w:rPr>
-                <w:rFonts w:ascii="Arial Narrow" w:hAnsi="Arial Narrow"/>
-                <w:b/>
-              </w:rPr>
-              <w:t>: {</w:t>
-            </w:r>
-            <w:proofErr w:type="spellStart"/>
-            <w:r>
-              <w:rPr>
-                <w:rFonts w:ascii="Arial Narrow" w:hAnsi="Arial Narrow"/>
-                <w:b/>
-              </w:rPr>
-              <w:t>supportSoundSystemCount</w:t>
-            </w:r>
-            <w:proofErr w:type="spellEnd"/>
-            <w:r>
-              <w:rPr>
-                <w:rFonts w:ascii="Arial Narrow" w:hAnsi="Arial Narrow"/>
-                <w:b/>
-              </w:rPr>
-              <w:t>} PCS</w:t>
-            </w:r>
-          </w:p>
-        </w:tc>
-        <w:tc>
-          <w:tcPr>
-            <w:tcW w:w="4674" w:type="dxa"/>
-          </w:tcPr>
-          <w:p>
-            <w:pPr>
-              <w:spacing w:after="0"/>
-              <w:jc w:val="both"/>
-              <w:rPr>
-                <w:rFonts w:ascii="Century Gothic" w:hAnsi="Century Gothic"/>
-                <w:b/>
-                <w:color w:val="ED7D31" w:themeColor="accent2"/>
-                <w:sz w:val="20"/>
-              </w:rPr>
-            </w:pPr>
-            <w:r>
-              <w:rPr>
-                <w:rFonts w:ascii="Arial Narrow" w:hAnsi="Arial Narrow"/>
-                <w:b/>
-              </w:rPr>
-              <w:t>({</w:t>
-            </w:r>
-            <w:proofErr w:type="spellStart"/>
-            <w:r>
-              <w:rPr>
-                <w:rFonts w:ascii="Arial Narrow" w:hAnsi="Arial Narrow"/>
-                <w:b/>
-              </w:rPr>
-              <w:t>supportMicrophone</w:t>
-            </w:r>
-            <w:proofErr w:type="spellEnd"/>
-            <w:r>
-              <w:rPr>
-                <w:rFonts w:ascii="Arial Narrow" w:hAnsi="Arial Narrow"/>
-                <w:b/>
-              </w:rPr>
-              <w:t xml:space="preserve">}) </w:t>
-            </w:r>
-            <w:proofErr w:type="gramStart"/>
-            <w:r>
-              <w:rPr>
-                <w:rFonts w:ascii="Arial Narrow" w:hAnsi="Arial Narrow"/>
-                <w:b/>
-              </w:rPr>
-              <w:t>MICROPHONE</w:t>
-            </w:r>
-            <w:r>
-              <w:rPr>
-                <w:rFonts w:ascii="Arial Narrow" w:hAnsi="Arial Narrow"/>
-                <w:b/>
-              </w:rPr>
-              <w:t xml:space="preserve">: </w:t>
-            </w:r>
-            <w:r>
-              <w:rPr>
-                <w:rFonts w:ascii="Arial Narrow" w:hAnsi="Arial Narrow"/>
-                <w:b/>
-              </w:rPr>
-              <w:t>{</w:t>
-            </w:r>
-            <w:proofErr w:type="spellStart"/>
-            <w:proofErr w:type="gramEnd"/>
-            <w:r>
-              <w:rPr>
-                <w:rFonts w:ascii="Arial Narrow" w:hAnsi="Arial Narrow"/>
-                <w:b/>
-              </w:rPr>
-              <w:t>supportMicrophoneCount</w:t>
-            </w:r>
-            <w:proofErr w:type="spellEnd"/>
-            <w:r>
-              <w:rPr>
-                <w:rFonts w:ascii="Arial Narrow" w:hAnsi="Arial Narrow"/>
-                <w:b/>
-              </w:rPr>
-              <w:t>} PCS</w:t>
-            </w:r>
-          </w:p>
-        </w:tc>
-      </w:tr>
-      <w:tr>
-        <w:tc>
-          <w:tcPr>
-            <w:tcW w:w="4676" w:type="dxa"/>
-          </w:tcPr>
-          <w:p>
-            <w:pPr>
-              <w:spacing w:after="0"/>
-              <w:jc w:val="both"/>
-              <w:rPr>
-                <w:rFonts w:ascii="Century Gothic" w:hAnsi="Century Gothic"/>
-                <w:b/>
-                <w:color w:val="ED7D31" w:themeColor="accent2"/>
-                <w:sz w:val="20"/>
-              </w:rPr>
-            </w:pPr>
-            <w:r>
-              <w:rPr>
-                <w:rFonts w:ascii="Arial Narrow" w:hAnsi="Arial Narrow"/>
-                <w:b/>
-              </w:rPr>
-              <w:t>({</w:t>
-            </w:r>
-            <w:proofErr w:type="spellStart"/>
-            <w:r>
-              <w:rPr>
-                <w:rFonts w:ascii="Arial Narrow" w:hAnsi="Arial Narrow"/>
-                <w:b/>
-              </w:rPr>
-              <w:t>supportLcdProjector</w:t>
-            </w:r>
-            <w:proofErr w:type="spellEnd"/>
-            <w:r>
-              <w:rPr>
-                <w:rFonts w:ascii="Arial Narrow" w:hAnsi="Arial Narrow"/>
-                <w:b/>
-              </w:rPr>
-              <w:t xml:space="preserve">}) </w:t>
-            </w:r>
-            <w:r>
-              <w:rPr>
-                <w:rFonts w:ascii="Arial Narrow" w:hAnsi="Arial Narrow"/>
-                <w:b/>
-              </w:rPr>
-              <w:t xml:space="preserve">LCD </w:t>
-            </w:r>
-            <w:proofErr w:type="gramStart"/>
-            <w:r>
-              <w:rPr>
-                <w:rFonts w:ascii="Arial Narrow" w:hAnsi="Arial Narrow"/>
-                <w:b/>
-              </w:rPr>
-              <w:t>PROJECTOR</w:t>
-            </w:r>
-            <w:r>
-              <w:rPr>
-                <w:rFonts w:ascii="Arial Narrow" w:hAnsi="Arial Narrow"/>
-                <w:b/>
-              </w:rPr>
-              <w:t>: {</w:t>
-            </w:r>
-            <w:proofErr w:type="spellStart"/>
-            <w:proofErr w:type="gramEnd"/>
-            <w:r>
-              <w:rPr>
-                <w:rFonts w:ascii="Arial Narrow" w:hAnsi="Arial Narrow"/>
-                <w:b/>
-              </w:rPr>
-              <w:t>supportLCdProjectorCount</w:t>
-            </w:r>
-            <w:proofErr w:type="spellEnd"/>
-            <w:r>
-              <w:rPr>
-                <w:rFonts w:ascii="Arial Narrow" w:hAnsi="Arial Narrow"/>
-                <w:b/>
-              </w:rPr>
-              <w:t>} PCS</w:t>
-            </w:r>
-          </w:p>
-        </w:tc>
-        <w:tc>
-          <w:tcPr>
-            <w:tcW w:w="4674" w:type="dxa"/>
-          </w:tcPr>
-          <w:p>
-            <w:pPr>
-              <w:spacing w:after="0"/>
-              <w:jc w:val="both"/>
-            </w:pPr>
-            <w:r>
-              <w:rPr>
-                <w:rFonts w:ascii="Arial Narrow" w:hAnsi="Arial Narrow"/>
-                <w:b/>
-              </w:rPr>
-              <w:t>(</w:t>
-            </w:r>
-            <w:r>
-              <w:rPr>
-                <w:rFonts w:ascii="Arial Narrow" w:hAnsi="Arial Narrow"/>
-                <w:b/>
-              </w:rPr>
-              <w:t>{</w:t>
-            </w:r>
-            <w:proofErr w:type="spellStart"/>
-            <w:r>
-              <w:rPr>
-                <w:rFonts w:ascii="Arial Narrow" w:hAnsi="Arial Narrow"/>
-                <w:b/>
-              </w:rPr>
-              <w:t>supportLongTable</w:t>
-            </w:r>
-            <w:proofErr w:type="spellEnd"/>
-            <w:r>
-              <w:rPr>
-                <w:rFonts w:ascii="Arial Narrow" w:hAnsi="Arial Narrow"/>
-                <w:b/>
-              </w:rPr>
-              <w:t>}</w:t>
-            </w:r>
-            <w:r>
-              <w:rPr>
-                <w:rFonts w:ascii="Arial Narrow" w:hAnsi="Arial Narrow"/>
-                <w:b/>
-              </w:rPr>
-              <w:t>)</w:t>
-            </w:r>
-            <w:r>
-              <w:rPr>
-                <w:rFonts w:ascii="Arial Narrow" w:hAnsi="Arial Narrow"/>
-                <w:b/>
-              </w:rPr>
-              <w:t xml:space="preserve"> </w:t>
-            </w:r>
-            <w:proofErr w:type="gramStart"/>
-            <w:r>
-              <w:rPr>
-                <w:rFonts w:ascii="Arial Narrow" w:hAnsi="Arial Narrow"/>
-                <w:b/>
-              </w:rPr>
-              <w:t>TABLE</w:t>
-            </w:r>
-            <w:r>
-              <w:rPr>
-                <w:rFonts w:ascii="Arial Narrow" w:hAnsi="Arial Narrow"/>
-                <w:b/>
-              </w:rPr>
-              <w:t>S: {</w:t>
-            </w:r>
-            <w:proofErr w:type="spellStart"/>
-            <w:proofErr w:type="gramEnd"/>
-            <w:r>
-              <w:rPr>
-                <w:rFonts w:ascii="Arial Narrow" w:hAnsi="Arial Narrow"/>
-                <w:b/>
-              </w:rPr>
-              <w:t>supportTableCount</w:t>
-            </w:r>
-            <w:proofErr w:type="spellEnd"/>
-            <w:r>
-              <w:rPr>
-                <w:rFonts w:ascii="Arial Narrow" w:hAnsi="Arial Narrow"/>
-                <w:b/>
-              </w:rPr>
-              <w:t>} PCS</w:t>
-            </w:r>
-            <w:r>
-              <w:rPr>
-                <w:b/>
-              </w:rPr>
-              <w:t xml:space="preserve"> </w:t>
-            </w:r>
-          </w:p>
-        </w:tc>
-      </w:tr>
-      <w:tr>
-        <w:tc>
-          <w:tcPr>
-            <w:tcW w:w="4676" w:type="dxa"/>
-          </w:tcPr>
-          <w:p>
-            <w:pPr>
-              <w:spacing w:after="0"/>
-              <w:rPr>
-                <w:rFonts w:ascii="Century Gothic" w:hAnsi="Century Gothic"/>
-                <w:b/>
-                <w:color w:val="ED7D31" w:themeColor="accent2"/>
-                <w:sz w:val="20"/>
-              </w:rPr>
-            </w:pPr>
-            <w:r>
-              <w:rPr>
-                <w:rFonts w:ascii="Arial Narrow" w:hAnsi="Arial Narrow"/>
-                <w:b/>
-              </w:rPr>
-              <w:t>({</w:t>
-            </w:r>
-            <w:proofErr w:type="spellStart"/>
-            <w:r>
-              <w:rPr>
-                <w:rFonts w:ascii="Arial Narrow" w:hAnsi="Arial Narrow"/>
-                <w:b/>
-              </w:rPr>
-              <w:t>supportChairs</w:t>
-            </w:r>
-            <w:proofErr w:type="spellEnd"/>
-            <w:r>
-              <w:rPr>
-                <w:rFonts w:ascii="Arial Narrow" w:hAnsi="Arial Narrow"/>
-                <w:b/>
-              </w:rPr>
-              <w:t xml:space="preserve">}) </w:t>
-            </w:r>
-            <w:proofErr w:type="gramStart"/>
-            <w:r>
-              <w:rPr>
-                <w:rFonts w:ascii="Arial Narrow" w:hAnsi="Arial Narrow"/>
-                <w:b/>
-              </w:rPr>
-              <w:t>CHAIRS: {</w:t>
-            </w:r>
-            <w:proofErr w:type="spellStart"/>
-            <w:proofErr w:type="gramEnd"/>
-            <w:r>
-              <w:rPr>
-                <w:rFonts w:ascii="Arial Narrow" w:hAnsi="Arial Narrow"/>
-                <w:b/>
-              </w:rPr>
-              <w:t>supportChairsCount</w:t>
-            </w:r>
-            <w:proofErr w:type="spellEnd"/>
-            <w:r>
-              <w:rPr>
-                <w:rFonts w:ascii="Arial Narrow" w:hAnsi="Arial Narrow"/>
-                <w:b/>
-              </w:rPr>
-              <w:t>} PCS</w:t>
-            </w:r>
-          </w:p>
-        </w:tc>
-        <w:tc>
-          <w:tcPr>
-            <w:tcW w:w="4674" w:type="dxa"/>
-          </w:tcPr>
-          <w:p>
-            <w:pPr>
-              <w:spacing w:after="0"/>
-              <w:rPr>
-                <w:rFonts w:ascii="Arial Narrow" w:hAnsi="Arial Narrow"/>
-                <w:b/>
-              </w:rPr>
-            </w:pPr>
-            <w:r>
-              <w:rPr>
-                <w:rFonts w:ascii="Arial Narrow" w:hAnsi="Arial Narrow"/>
-                <w:b/>
-              </w:rPr>
-              <w:t>OTHERS: {</w:t>
-            </w:r>
-            <w:proofErr w:type="spellStart"/>
-            <w:r>
-              <w:rPr>
-                <w:rFonts w:ascii="Arial Narrow" w:hAnsi="Arial Narrow"/>
-                <w:b/>
-              </w:rPr>
-              <w:t>otherSupport</w:t>
-            </w:r>
-            <w:proofErr w:type="spellEnd"/>
-            <w:r>
-              <w:rPr>
-                <w:rFonts w:ascii="Arial Narrow" w:hAnsi="Arial Narrow"/>
-                <w:b/>
-              </w:rPr>
-              <w:t>}</w:t>
-            </w:r>
-          </w:p>
-          <w:p>
-            <w:pPr>
-              <w:spacing w:after="0"/>
-              <w:rPr>
-                <w:rFonts w:ascii="Arial Narrow" w:hAnsi="Arial Narrow"/>
-                <w:b/>
-              </w:rPr>
-            </w:pPr>
-          </w:p>
-        </w:tc>
-      </w:tr>
-      <w:tr>
-        <w:trPr>
-          <w:gridAfter w:val="1"/>
-          <w:wAfter w:w="4674" w:type="dxa"/>
-          <w:trHeight w:val="804"/>
-        </w:trPr>
-        <w:tc>
-          <w:tcPr>
-            <w:tcW w:w="4676" w:type="dxa"/>
-          </w:tcPr>
-          <w:p>
-            <w:pPr>
-              <w:spacing w:after="0"/>
-              <w:rPr>
-                <w:rFonts w:ascii="Arial Narrow" w:hAnsi="Arial Narrow"/>
-                <w:b/>
-              </w:rPr>
-            </w:pPr>
-            <w:r>
-              <w:rPr>
-                <w:rFonts w:ascii="Arial Narrow" w:hAnsi="Arial Narrow"/>
-                <w:b/>
-              </w:rPr>
-              <w:t>PROVISION FOR STUDENTS WITH DIVERSE NEEDS: {</w:t>
-            </w:r>
-            <w:proofErr w:type="spellStart"/>
-            <w:r>
-              <w:rPr>
-                <w:rFonts w:ascii="Arial Narrow" w:hAnsi="Arial Narrow"/>
-                <w:b/>
-              </w:rPr>
-              <w:t>extraProvisions</w:t>
-            </w:r>
-            <w:proofErr w:type="spellEnd"/>
-            <w:r>
-              <w:rPr>
-                <w:rFonts w:ascii="Arial Narrow" w:hAnsi="Arial Narrow"/>
-                <w:b/>
-              </w:rPr>
-              <w:t>}</w:t>
-            </w:r>
-          </w:p>
-        </w:tc>
-      </w:tr>
-    </w:tbl>
-    <w:p>
-      <w:pPr>
-        <w:spacing w:after="0"/>
         <w:jc w:val="both"/>
         <w:rPr>
           <w:rFonts w:ascii="Century Gothic" w:hAnsi="Century Gothic"/>
@@ -5179,7 +4137,6 @@
           <w:bCs/>
           <w:sz w:val="20"/>
         </w:rPr>
-        <w:lastRenderedPageBreak/>
         <w:t>{</w:t>
       </w:r>
       <w:proofErr w:type="spellStart"/>
@@ -5980,6 +4937,7 @@
               <w:rPr>
                 <w:rFonts w:ascii="Arial Narrow" w:hAnsi="Arial Narrow"/>
               </w:rPr>
+              <w:lastRenderedPageBreak/>
               <w:t>Prepared by:</w:t>
             </w:r>
           </w:p>
@@ -7146,7 +6104,6 @@
               <w:rPr>
                 <w:rFonts w:ascii="Arial Narrow" w:hAnsi="Arial Narrow"/>
               </w:rPr>
-              <w:lastRenderedPageBreak/>
               <w:t>Remarks: {</w:t>
             </w:r>
             <w:proofErr w:type="spellStart"/>

</xml_diff>